<commit_message>
Hotfix for bills added
</commit_message>
<xml_diff>
--- a/docs/Manual-Plataforma-OCR.docx
+++ b/docs/Manual-Plataforma-OCR.docx
@@ -260,8 +260,34 @@
       </w:r>
     </w:p>
     <w:p>
+      <w:pPr>
+        <w:spacing w:after="60"/>
+      </w:pPr>
+      <w:r>
+        <w:rPr>
+          <w:rFonts w:ascii="Consolas" w:hAnsi="Consolas"/>
+          <w:color w:val="008AA8"/>
+        </w:rPr>
+        <w:t xml:space="preserve">15   </w:t>
+      </w:r>
+      <w:r>
+        <w:rPr/>
+        <w:t xml:space="preserve">Política de mitigación de riesgo del OCR</w:t>
+      </w:r>
+    </w:p>
+    <w:p>
       <w:r>
         <w:br w:type="page"/>
+      </w:r>
+    </w:p>
+    <w:p>
+      <w:r>
+        <w:rPr>
+          <w:i/>
+          <w:color w:val="4F5B6E"/>
+          <w:sz w:val="18"/>
+        </w:rPr>
+        <w:t>Las capturas de pantalla usan datos de ejemplo: los nombres, correos y cifras no son reales.</w:t>
       </w:r>
     </w:p>
     <w:p>
@@ -626,6 +652,130 @@
     </w:p>
     <w:p>
       <w:pPr>
+        <w:keepNext/>
+        <w:spacing w:before="160"/>
+        <w:jc w:val="center"/>
+      </w:pPr>
+      <w:r>
+        <w:drawing>
+          <wp:inline xmlns:a="http://schemas.openxmlformats.org/drawingml/2006/main" xmlns:pic="http://schemas.openxmlformats.org/drawingml/2006/picture">
+            <wp:extent cx="5760000" cy="3600000"/>
+            <wp:docPr id="2" name="Picture 2"/>
+            <wp:cNvGraphicFramePr>
+              <a:graphicFrameLocks noChangeAspect="1"/>
+            </wp:cNvGraphicFramePr>
+            <a:graphic>
+              <a:graphicData uri="http://schemas.openxmlformats.org/drawingml/2006/picture">
+                <pic:pic>
+                  <pic:nvPicPr>
+                    <pic:cNvPr id="0" name="01-inicio-sesion.png"/>
+                    <pic:cNvPicPr/>
+                  </pic:nvPicPr>
+                  <pic:blipFill>
+                    <a:blip r:embed="rId12"/>
+                    <a:stretch>
+                      <a:fillRect/>
+                    </a:stretch>
+                  </pic:blipFill>
+                  <pic:spPr>
+                    <a:xfrm>
+                      <a:off x="0" y="0"/>
+                      <a:ext cx="5760000" cy="3600000"/>
+                    </a:xfrm>
+                    <a:prstGeom prst="rect"/>
+                  </pic:spPr>
+                </pic:pic>
+              </a:graphicData>
+            </a:graphic>
+          </wp:inline>
+        </w:drawing>
+      </w:r>
+    </w:p>
+    <w:p>
+      <w:pPr>
+        <w:spacing w:after="240"/>
+        <w:jc w:val="center"/>
+      </w:pPr>
+      <w:r>
+        <w:rPr>
+          <w:b/>
+          <w:color w:val="4F5B6E"/>
+          <w:sz w:val="18"/>
+        </w:rPr>
+        <w:t xml:space="preserve">Figura 1. </w:t>
+      </w:r>
+      <w:r>
+        <w:rPr>
+          <w:color w:val="4F5B6E"/>
+          <w:sz w:val="18"/>
+        </w:rPr>
+        <w:t>Pantalla de inicio de sesión.</w:t>
+      </w:r>
+    </w:p>
+    <w:p>
+      <w:pPr>
+        <w:keepNext/>
+        <w:spacing w:before="160"/>
+        <w:jc w:val="center"/>
+      </w:pPr>
+      <w:r>
+        <w:drawing>
+          <wp:inline xmlns:a="http://schemas.openxmlformats.org/drawingml/2006/main" xmlns:pic="http://schemas.openxmlformats.org/drawingml/2006/picture">
+            <wp:extent cx="5760000" cy="3600000"/>
+            <wp:docPr id="1" name="Picture 1"/>
+            <wp:cNvGraphicFramePr>
+              <a:graphicFrameLocks noChangeAspect="1"/>
+            </wp:cNvGraphicFramePr>
+            <a:graphic>
+              <a:graphicData uri="http://schemas.openxmlformats.org/drawingml/2006/picture">
+                <pic:pic>
+                  <pic:nvPicPr>
+                    <pic:cNvPr id="0" name="02-inicio-sesion-error.png"/>
+                    <pic:cNvPicPr/>
+                  </pic:nvPicPr>
+                  <pic:blipFill>
+                    <a:blip r:embed="rId11"/>
+                    <a:stretch>
+                      <a:fillRect/>
+                    </a:stretch>
+                  </pic:blipFill>
+                  <pic:spPr>
+                    <a:xfrm>
+                      <a:off x="0" y="0"/>
+                      <a:ext cx="5760000" cy="3600000"/>
+                    </a:xfrm>
+                    <a:prstGeom prst="rect"/>
+                  </pic:spPr>
+                </pic:pic>
+              </a:graphicData>
+            </a:graphic>
+          </wp:inline>
+        </w:drawing>
+      </w:r>
+    </w:p>
+    <w:p>
+      <w:pPr>
+        <w:spacing w:after="240"/>
+        <w:jc w:val="center"/>
+      </w:pPr>
+      <w:r>
+        <w:rPr>
+          <w:b/>
+          <w:color w:val="4F5B6E"/>
+          <w:sz w:val="18"/>
+        </w:rPr>
+        <w:t xml:space="preserve">Figura 2. </w:t>
+      </w:r>
+      <w:r>
+        <w:rPr>
+          <w:color w:val="4F5B6E"/>
+          <w:sz w:val="18"/>
+        </w:rPr>
+        <w:t>Mensaje cuando el correo o la contraseña no coinciden.</w:t>
+      </w:r>
+    </w:p>
+    <w:p>
+      <w:pPr>
         <w:pStyle w:val="Heading2"/>
       </w:pPr>
       <w:r>
@@ -662,6 +812,68 @@
     </w:p>
     <w:p>
       <w:pPr>
+        <w:keepNext/>
+        <w:spacing w:before="160"/>
+        <w:jc w:val="center"/>
+      </w:pPr>
+      <w:r>
+        <w:drawing>
+          <wp:inline xmlns:a="http://schemas.openxmlformats.org/drawingml/2006/main" xmlns:pic="http://schemas.openxmlformats.org/drawingml/2006/picture">
+            <wp:extent cx="5760000" cy="3600000"/>
+            <wp:docPr id="3" name="Picture 3"/>
+            <wp:cNvGraphicFramePr>
+              <a:graphicFrameLocks noChangeAspect="1"/>
+            </wp:cNvGraphicFramePr>
+            <a:graphic>
+              <a:graphicData uri="http://schemas.openxmlformats.org/drawingml/2006/picture">
+                <pic:pic>
+                  <pic:nvPicPr>
+                    <pic:cNvPr id="0" name="03-recuperar-contrasena.png"/>
+                    <pic:cNvPicPr/>
+                  </pic:nvPicPr>
+                  <pic:blipFill>
+                    <a:blip r:embed="rId13"/>
+                    <a:stretch>
+                      <a:fillRect/>
+                    </a:stretch>
+                  </pic:blipFill>
+                  <pic:spPr>
+                    <a:xfrm>
+                      <a:off x="0" y="0"/>
+                      <a:ext cx="5760000" cy="3600000"/>
+                    </a:xfrm>
+                    <a:prstGeom prst="rect"/>
+                  </pic:spPr>
+                </pic:pic>
+              </a:graphicData>
+            </a:graphic>
+          </wp:inline>
+        </w:drawing>
+      </w:r>
+    </w:p>
+    <w:p>
+      <w:pPr>
+        <w:spacing w:after="240"/>
+        <w:jc w:val="center"/>
+      </w:pPr>
+      <w:r>
+        <w:rPr>
+          <w:b/>
+          <w:color w:val="4F5B6E"/>
+          <w:sz w:val="18"/>
+        </w:rPr>
+        <w:t xml:space="preserve">Figura 3. </w:t>
+      </w:r>
+      <w:r>
+        <w:rPr>
+          <w:color w:val="4F5B6E"/>
+          <w:sz w:val="18"/>
+        </w:rPr>
+        <w:t>Aviso tras pedir el enlace para restablecer la contraseña.</w:t>
+      </w:r>
+    </w:p>
+    <w:p>
+      <w:pPr>
         <w:pStyle w:val="Heading2"/>
       </w:pPr>
       <w:r>
@@ -797,6 +1009,192 @@
       </w:r>
     </w:p>
     <w:p>
+      <w:pPr>
+        <w:keepNext/>
+        <w:spacing w:before="160"/>
+        <w:jc w:val="center"/>
+      </w:pPr>
+      <w:r>
+        <w:drawing>
+          <wp:inline xmlns:a="http://schemas.openxmlformats.org/drawingml/2006/main" xmlns:pic="http://schemas.openxmlformats.org/drawingml/2006/picture">
+            <wp:extent cx="5760000" cy="3600000"/>
+            <wp:docPr id="6" name="Picture 6"/>
+            <wp:cNvGraphicFramePr>
+              <a:graphicFrameLocks noChangeAspect="1"/>
+            </wp:cNvGraphicFramePr>
+            <a:graphic>
+              <a:graphicData uri="http://schemas.openxmlformats.org/drawingml/2006/picture">
+                <pic:pic>
+                  <pic:nvPicPr>
+                    <pic:cNvPr id="0" name="05-usuario-menu-cuenta.png"/>
+                    <pic:cNvPicPr/>
+                  </pic:nvPicPr>
+                  <pic:blipFill>
+                    <a:blip r:embed="rId16"/>
+                    <a:stretch>
+                      <a:fillRect/>
+                    </a:stretch>
+                  </pic:blipFill>
+                  <pic:spPr>
+                    <a:xfrm>
+                      <a:off x="0" y="0"/>
+                      <a:ext cx="5760000" cy="3600000"/>
+                    </a:xfrm>
+                    <a:prstGeom prst="rect"/>
+                  </pic:spPr>
+                </pic:pic>
+              </a:graphicData>
+            </a:graphic>
+          </wp:inline>
+        </w:drawing>
+      </w:r>
+    </w:p>
+    <w:p>
+      <w:pPr>
+        <w:spacing w:after="240"/>
+        <w:jc w:val="center"/>
+      </w:pPr>
+      <w:r>
+        <w:rPr>
+          <w:b/>
+          <w:color w:val="4F5B6E"/>
+          <w:sz w:val="18"/>
+        </w:rPr>
+        <w:t xml:space="preserve">Figura 4. </w:t>
+      </w:r>
+      <w:r>
+        <w:rPr>
+          <w:color w:val="4F5B6E"/>
+          <w:sz w:val="18"/>
+        </w:rPr>
+        <w:t>Menú de la cuenta, con nombre, correo, rol y «Cerrar sesión».</w:t>
+      </w:r>
+    </w:p>
+    <w:p>
+      <w:pPr>
+        <w:keepNext/>
+        <w:spacing w:before="160"/>
+        <w:jc w:val="center"/>
+      </w:pPr>
+      <w:r>
+        <w:drawing>
+          <wp:inline xmlns:a="http://schemas.openxmlformats.org/drawingml/2006/main" xmlns:pic="http://schemas.openxmlformats.org/drawingml/2006/picture">
+            <wp:extent cx="5760000" cy="3600000"/>
+            <wp:docPr id="5" name="Picture 5"/>
+            <wp:cNvGraphicFramePr>
+              <a:graphicFrameLocks noChangeAspect="1"/>
+            </wp:cNvGraphicFramePr>
+            <a:graphic>
+              <a:graphicData uri="http://schemas.openxmlformats.org/drawingml/2006/picture">
+                <pic:pic>
+                  <pic:nvPicPr>
+                    <pic:cNvPr id="0" name="09-no-permitido.png"/>
+                    <pic:cNvPicPr/>
+                  </pic:nvPicPr>
+                  <pic:blipFill>
+                    <a:blip r:embed="rId15"/>
+                    <a:stretch>
+                      <a:fillRect/>
+                    </a:stretch>
+                  </pic:blipFill>
+                  <pic:spPr>
+                    <a:xfrm>
+                      <a:off x="0" y="0"/>
+                      <a:ext cx="5760000" cy="3600000"/>
+                    </a:xfrm>
+                    <a:prstGeom prst="rect"/>
+                  </pic:spPr>
+                </pic:pic>
+              </a:graphicData>
+            </a:graphic>
+          </wp:inline>
+        </w:drawing>
+      </w:r>
+    </w:p>
+    <w:p>
+      <w:pPr>
+        <w:spacing w:after="240"/>
+        <w:jc w:val="center"/>
+      </w:pPr>
+      <w:r>
+        <w:rPr>
+          <w:b/>
+          <w:color w:val="4F5B6E"/>
+          <w:sz w:val="18"/>
+        </w:rPr>
+        <w:t xml:space="preserve">Figura 5. </w:t>
+      </w:r>
+      <w:r>
+        <w:rPr>
+          <w:color w:val="4F5B6E"/>
+          <w:sz w:val="18"/>
+        </w:rPr>
+        <w:t>Pantalla «No permitido» al abrir una página de otro rol.</w:t>
+      </w:r>
+    </w:p>
+    <w:p>
+      <w:pPr>
+        <w:keepNext/>
+        <w:spacing w:before="160"/>
+        <w:jc w:val="center"/>
+      </w:pPr>
+      <w:r>
+        <w:drawing>
+          <wp:inline xmlns:a="http://schemas.openxmlformats.org/drawingml/2006/main" xmlns:pic="http://schemas.openxmlformats.org/drawingml/2006/picture">
+            <wp:extent cx="2340000" cy="5064000"/>
+            <wp:docPr id="4" name="Picture 4"/>
+            <wp:cNvGraphicFramePr>
+              <a:graphicFrameLocks noChangeAspect="1"/>
+            </wp:cNvGraphicFramePr>
+            <a:graphic>
+              <a:graphicData uri="http://schemas.openxmlformats.org/drawingml/2006/picture">
+                <pic:pic>
+                  <pic:nvPicPr>
+                    <pic:cNvPr id="0" name="10-usuario-movil.png"/>
+                    <pic:cNvPicPr/>
+                  </pic:nvPicPr>
+                  <pic:blipFill>
+                    <a:blip r:embed="rId14"/>
+                    <a:stretch>
+                      <a:fillRect/>
+                    </a:stretch>
+                  </pic:blipFill>
+                  <pic:spPr>
+                    <a:xfrm>
+                      <a:off x="0" y="0"/>
+                      <a:ext cx="2340000" cy="5064000"/>
+                    </a:xfrm>
+                    <a:prstGeom prst="rect"/>
+                  </pic:spPr>
+                </pic:pic>
+              </a:graphicData>
+            </a:graphic>
+          </wp:inline>
+        </w:drawing>
+      </w:r>
+    </w:p>
+    <w:p>
+      <w:pPr>
+        <w:spacing w:after="240"/>
+        <w:jc w:val="center"/>
+      </w:pPr>
+      <w:r>
+        <w:rPr>
+          <w:b/>
+          <w:color w:val="4F5B6E"/>
+          <w:sz w:val="18"/>
+        </w:rPr>
+        <w:t xml:space="preserve">Figura 6. </w:t>
+      </w:r>
+      <w:r>
+        <w:rPr>
+          <w:color w:val="4F5B6E"/>
+          <w:sz w:val="18"/>
+        </w:rPr>
+        <w:t>La plataforma en el navegador del celular.</w:t>
+      </w:r>
+    </w:p>
+    <w:p>
       <w:r>
         <w:br w:type="page"/>
       </w:r>
@@ -980,6 +1378,68 @@
       <w:r>
         <w:rPr/>
         <w:t xml:space="preserve"> mientras no cumplas esos mínimos.</w:t>
+      </w:r>
+    </w:p>
+    <w:p>
+      <w:pPr>
+        <w:keepNext/>
+        <w:spacing w:before="160"/>
+        <w:jc w:val="center"/>
+      </w:pPr>
+      <w:r>
+        <w:drawing>
+          <wp:inline xmlns:a="http://schemas.openxmlformats.org/drawingml/2006/main" xmlns:pic="http://schemas.openxmlformats.org/drawingml/2006/picture">
+            <wp:extent cx="5760000" cy="5269333"/>
+            <wp:docPr id="7" name="Picture 7"/>
+            <wp:cNvGraphicFramePr>
+              <a:graphicFrameLocks noChangeAspect="1"/>
+            </wp:cNvGraphicFramePr>
+            <a:graphic>
+              <a:graphicData uri="http://schemas.openxmlformats.org/drawingml/2006/picture">
+                <pic:pic>
+                  <pic:nvPicPr>
+                    <pic:cNvPr id="0" name="04-usuario-panel.png"/>
+                    <pic:cNvPicPr/>
+                  </pic:nvPicPr>
+                  <pic:blipFill>
+                    <a:blip r:embed="rId17"/>
+                    <a:stretch>
+                      <a:fillRect/>
+                    </a:stretch>
+                  </pic:blipFill>
+                  <pic:spPr>
+                    <a:xfrm>
+                      <a:off x="0" y="0"/>
+                      <a:ext cx="5760000" cy="5269333"/>
+                    </a:xfrm>
+                    <a:prstGeom prst="rect"/>
+                  </pic:spPr>
+                </pic:pic>
+              </a:graphicData>
+            </a:graphic>
+          </wp:inline>
+        </w:drawing>
+      </w:r>
+    </w:p>
+    <w:p>
+      <w:pPr>
+        <w:spacing w:after="240"/>
+        <w:jc w:val="center"/>
+      </w:pPr>
+      <w:r>
+        <w:rPr>
+          <w:b/>
+          <w:color w:val="4F5B6E"/>
+          <w:sz w:val="18"/>
+        </w:rPr>
+        <w:t xml:space="preserve">Figura 7. </w:t>
+      </w:r>
+      <w:r>
+        <w:rPr>
+          <w:color w:val="4F5B6E"/>
+          <w:sz w:val="18"/>
+        </w:rPr>
+        <w:t>Panel del usuario: campañas, puntos, hitos y escáner.</w:t>
       </w:r>
     </w:p>
     <w:p>
@@ -1111,6 +1571,68 @@
       <w:r>
         <w:rPr/>
         <w:t>Revisa el resultado debajo.</w:t>
+      </w:r>
+    </w:p>
+    <w:p>
+      <w:pPr>
+        <w:keepNext/>
+        <w:spacing w:before="160"/>
+        <w:jc w:val="center"/>
+      </w:pPr>
+      <w:r>
+        <w:drawing>
+          <wp:inline xmlns:a="http://schemas.openxmlformats.org/drawingml/2006/main" xmlns:pic="http://schemas.openxmlformats.org/drawingml/2006/picture">
+            <wp:extent cx="5760000" cy="3255211"/>
+            <wp:docPr id="8" name="Picture 8"/>
+            <wp:cNvGraphicFramePr>
+              <a:graphicFrameLocks noChangeAspect="1"/>
+            </wp:cNvGraphicFramePr>
+            <a:graphic>
+              <a:graphicData uri="http://schemas.openxmlformats.org/drawingml/2006/picture">
+                <pic:pic>
+                  <pic:nvPicPr>
+                    <pic:cNvPr id="0" name="06-usuario-leyendo.png"/>
+                    <pic:cNvPicPr/>
+                  </pic:nvPicPr>
+                  <pic:blipFill>
+                    <a:blip r:embed="rId18"/>
+                    <a:stretch>
+                      <a:fillRect/>
+                    </a:stretch>
+                  </pic:blipFill>
+                  <pic:spPr>
+                    <a:xfrm>
+                      <a:off x="0" y="0"/>
+                      <a:ext cx="5760000" cy="3255211"/>
+                    </a:xfrm>
+                    <a:prstGeom prst="rect"/>
+                  </pic:spPr>
+                </pic:pic>
+              </a:graphicData>
+            </a:graphic>
+          </wp:inline>
+        </w:drawing>
+      </w:r>
+    </w:p>
+    <w:p>
+      <w:pPr>
+        <w:spacing w:after="240"/>
+        <w:jc w:val="center"/>
+      </w:pPr>
+      <w:r>
+        <w:rPr>
+          <w:b/>
+          <w:color w:val="4F5B6E"/>
+          <w:sz w:val="18"/>
+        </w:rPr>
+        <w:t xml:space="preserve">Figura 8. </w:t>
+      </w:r>
+      <w:r>
+        <w:rPr>
+          <w:color w:val="4F5B6E"/>
+          <w:sz w:val="18"/>
+        </w:rPr>
+        <w:t>El escáner mientras lee el comprobante.</w:t>
       </w:r>
     </w:p>
     <w:p>
@@ -1346,6 +1868,130 @@
       <w:r>
         <w:rPr/>
         <w:t>Tras un escaneo con puntos, tus campañas se actualizan solas con el nuevo total.</w:t>
+      </w:r>
+    </w:p>
+    <w:p>
+      <w:pPr>
+        <w:keepNext/>
+        <w:spacing w:before="160"/>
+        <w:jc w:val="center"/>
+      </w:pPr>
+      <w:r>
+        <w:drawing>
+          <wp:inline xmlns:a="http://schemas.openxmlformats.org/drawingml/2006/main" xmlns:pic="http://schemas.openxmlformats.org/drawingml/2006/picture">
+            <wp:extent cx="5760000" cy="6104789"/>
+            <wp:docPr id="10" name="Picture 10"/>
+            <wp:cNvGraphicFramePr>
+              <a:graphicFrameLocks noChangeAspect="1"/>
+            </wp:cNvGraphicFramePr>
+            <a:graphic>
+              <a:graphicData uri="http://schemas.openxmlformats.org/drawingml/2006/picture">
+                <pic:pic>
+                  <pic:nvPicPr>
+                    <pic:cNvPr id="0" name="07-usuario-resultado.png"/>
+                    <pic:cNvPicPr/>
+                  </pic:nvPicPr>
+                  <pic:blipFill>
+                    <a:blip r:embed="rId20"/>
+                    <a:stretch>
+                      <a:fillRect/>
+                    </a:stretch>
+                  </pic:blipFill>
+                  <pic:spPr>
+                    <a:xfrm>
+                      <a:off x="0" y="0"/>
+                      <a:ext cx="5760000" cy="6104789"/>
+                    </a:xfrm>
+                    <a:prstGeom prst="rect"/>
+                  </pic:spPr>
+                </pic:pic>
+              </a:graphicData>
+            </a:graphic>
+          </wp:inline>
+        </w:drawing>
+      </w:r>
+    </w:p>
+    <w:p>
+      <w:pPr>
+        <w:spacing w:after="240"/>
+        <w:jc w:val="center"/>
+      </w:pPr>
+      <w:r>
+        <w:rPr>
+          <w:b/>
+          <w:color w:val="4F5B6E"/>
+          <w:sz w:val="18"/>
+        </w:rPr>
+        <w:t xml:space="preserve">Figura 9. </w:t>
+      </w:r>
+      <w:r>
+        <w:rPr>
+          <w:color w:val="4F5B6E"/>
+          <w:sz w:val="18"/>
+        </w:rPr>
+        <w:t>Resultado de un comprobante válido, con el texto extraído abierto.</w:t>
+      </w:r>
+    </w:p>
+    <w:p>
+      <w:pPr>
+        <w:keepNext/>
+        <w:spacing w:before="160"/>
+        <w:jc w:val="center"/>
+      </w:pPr>
+      <w:r>
+        <w:drawing>
+          <wp:inline xmlns:a="http://schemas.openxmlformats.org/drawingml/2006/main" xmlns:pic="http://schemas.openxmlformats.org/drawingml/2006/picture">
+            <wp:extent cx="5760000" cy="3667606"/>
+            <wp:docPr id="9" name="Picture 9"/>
+            <wp:cNvGraphicFramePr>
+              <a:graphicFrameLocks noChangeAspect="1"/>
+            </wp:cNvGraphicFramePr>
+            <a:graphic>
+              <a:graphicData uri="http://schemas.openxmlformats.org/drawingml/2006/picture">
+                <pic:pic>
+                  <pic:nvPicPr>
+                    <pic:cNvPr id="0" name="08-usuario-rechazo.png"/>
+                    <pic:cNvPicPr/>
+                  </pic:nvPicPr>
+                  <pic:blipFill>
+                    <a:blip r:embed="rId19"/>
+                    <a:stretch>
+                      <a:fillRect/>
+                    </a:stretch>
+                  </pic:blipFill>
+                  <pic:spPr>
+                    <a:xfrm>
+                      <a:off x="0" y="0"/>
+                      <a:ext cx="5760000" cy="3667606"/>
+                    </a:xfrm>
+                    <a:prstGeom prst="rect"/>
+                  </pic:spPr>
+                </pic:pic>
+              </a:graphicData>
+            </a:graphic>
+          </wp:inline>
+        </w:drawing>
+      </w:r>
+    </w:p>
+    <w:p>
+      <w:pPr>
+        <w:spacing w:after="240"/>
+        <w:jc w:val="center"/>
+      </w:pPr>
+      <w:r>
+        <w:rPr>
+          <w:b/>
+          <w:color w:val="4F5B6E"/>
+          <w:sz w:val="18"/>
+        </w:rPr>
+        <w:t xml:space="preserve">Figura 10. </w:t>
+      </w:r>
+      <w:r>
+        <w:rPr>
+          <w:color w:val="4F5B6E"/>
+          <w:sz w:val="18"/>
+        </w:rPr>
+        <w:t>Resultado de un comprobante rechazado por no tener TOTAL.</w:t>
       </w:r>
     </w:p>
     <w:p>
@@ -2498,6 +3144,68 @@
     </w:tbl>
     <w:p>
       <w:pPr>
+        <w:keepNext/>
+        <w:spacing w:before="160"/>
+        <w:jc w:val="center"/>
+      </w:pPr>
+      <w:r>
+        <w:drawing>
+          <wp:inline xmlns:a="http://schemas.openxmlformats.org/drawingml/2006/main" xmlns:pic="http://schemas.openxmlformats.org/drawingml/2006/picture">
+            <wp:extent cx="5760000" cy="5280000"/>
+            <wp:docPr id="11" name="Picture 11"/>
+            <wp:cNvGraphicFramePr>
+              <a:graphicFrameLocks noChangeAspect="1"/>
+            </wp:cNvGraphicFramePr>
+            <a:graphic>
+              <a:graphicData uri="http://schemas.openxmlformats.org/drawingml/2006/picture">
+                <pic:pic>
+                  <pic:nvPicPr>
+                    <pic:cNvPr id="0" name="11-admin-panel.png"/>
+                    <pic:cNvPicPr/>
+                  </pic:nvPicPr>
+                  <pic:blipFill>
+                    <a:blip r:embed="rId21"/>
+                    <a:stretch>
+                      <a:fillRect/>
+                    </a:stretch>
+                  </pic:blipFill>
+                  <pic:spPr>
+                    <a:xfrm>
+                      <a:off x="0" y="0"/>
+                      <a:ext cx="5760000" cy="5280000"/>
+                    </a:xfrm>
+                    <a:prstGeom prst="rect"/>
+                  </pic:spPr>
+                </pic:pic>
+              </a:graphicData>
+            </a:graphic>
+          </wp:inline>
+        </w:drawing>
+      </w:r>
+    </w:p>
+    <w:p>
+      <w:pPr>
+        <w:spacing w:after="240"/>
+        <w:jc w:val="center"/>
+      </w:pPr>
+      <w:r>
+        <w:rPr>
+          <w:b/>
+          <w:color w:val="4F5B6E"/>
+          <w:sz w:val="18"/>
+        </w:rPr>
+        <w:t xml:space="preserve">Figura 11. </w:t>
+      </w:r>
+      <w:r>
+        <w:rPr>
+          <w:color w:val="4F5B6E"/>
+          <w:sz w:val="18"/>
+        </w:rPr>
+        <w:t>Panel del administrador: resumen, unidades vendidas y productos más vendidos.</w:t>
+      </w:r>
+    </w:p>
+    <w:p>
+      <w:pPr>
         <w:spacing w:after="80"/>
       </w:pPr>
     </w:p>
@@ -2825,6 +3533,68 @@
     </w:tbl>
     <w:p>
       <w:pPr>
+        <w:keepNext/>
+        <w:spacing w:before="160"/>
+        <w:jc w:val="center"/>
+      </w:pPr>
+      <w:r>
+        <w:drawing>
+          <wp:inline xmlns:a="http://schemas.openxmlformats.org/drawingml/2006/main" xmlns:pic="http://schemas.openxmlformats.org/drawingml/2006/picture">
+            <wp:extent cx="5760000" cy="3952000"/>
+            <wp:docPr id="12" name="Picture 12"/>
+            <wp:cNvGraphicFramePr>
+              <a:graphicFrameLocks noChangeAspect="1"/>
+            </wp:cNvGraphicFramePr>
+            <a:graphic>
+              <a:graphicData uri="http://schemas.openxmlformats.org/drawingml/2006/picture">
+                <pic:pic>
+                  <pic:nvPicPr>
+                    <pic:cNvPr id="0" name="12-admin-productos.png"/>
+                    <pic:cNvPicPr/>
+                  </pic:nvPicPr>
+                  <pic:blipFill>
+                    <a:blip r:embed="rId22"/>
+                    <a:stretch>
+                      <a:fillRect/>
+                    </a:stretch>
+                  </pic:blipFill>
+                  <pic:spPr>
+                    <a:xfrm>
+                      <a:off x="0" y="0"/>
+                      <a:ext cx="5760000" cy="3952000"/>
+                    </a:xfrm>
+                    <a:prstGeom prst="rect"/>
+                  </pic:spPr>
+                </pic:pic>
+              </a:graphicData>
+            </a:graphic>
+          </wp:inline>
+        </w:drawing>
+      </w:r>
+    </w:p>
+    <w:p>
+      <w:pPr>
+        <w:spacing w:after="240"/>
+        <w:jc w:val="center"/>
+      </w:pPr>
+      <w:r>
+        <w:rPr>
+          <w:b/>
+          <w:color w:val="4F5B6E"/>
+          <w:sz w:val="18"/>
+        </w:rPr>
+        <w:t xml:space="preserve">Figura 12. </w:t>
+      </w:r>
+      <w:r>
+        <w:rPr>
+          <w:color w:val="4F5B6E"/>
+          <w:sz w:val="18"/>
+        </w:rPr>
+        <w:t>Catálogo de productos.</w:t>
+      </w:r>
+    </w:p>
+    <w:p>
+      <w:pPr>
         <w:spacing w:after="80"/>
       </w:pPr>
     </w:p>
@@ -3237,6 +4007,68 @@
       <w:r>
         <w:rPr/>
         <w:t>.</w:t>
+      </w:r>
+    </w:p>
+    <w:p>
+      <w:pPr>
+        <w:keepNext/>
+        <w:spacing w:before="160"/>
+        <w:jc w:val="center"/>
+      </w:pPr>
+      <w:r>
+        <w:drawing>
+          <wp:inline xmlns:a="http://schemas.openxmlformats.org/drawingml/2006/main" xmlns:pic="http://schemas.openxmlformats.org/drawingml/2006/picture">
+            <wp:extent cx="5760000" cy="6389333"/>
+            <wp:docPr id="13" name="Picture 13"/>
+            <wp:cNvGraphicFramePr>
+              <a:graphicFrameLocks noChangeAspect="1"/>
+            </wp:cNvGraphicFramePr>
+            <a:graphic>
+              <a:graphicData uri="http://schemas.openxmlformats.org/drawingml/2006/picture">
+                <pic:pic>
+                  <pic:nvPicPr>
+                    <pic:cNvPr id="0" name="15-admin-campana-editor.png"/>
+                    <pic:cNvPicPr/>
+                  </pic:nvPicPr>
+                  <pic:blipFill>
+                    <a:blip r:embed="rId23"/>
+                    <a:stretch>
+                      <a:fillRect/>
+                    </a:stretch>
+                  </pic:blipFill>
+                  <pic:spPr>
+                    <a:xfrm>
+                      <a:off x="0" y="0"/>
+                      <a:ext cx="5760000" cy="6389333"/>
+                    </a:xfrm>
+                    <a:prstGeom prst="rect"/>
+                  </pic:spPr>
+                </pic:pic>
+              </a:graphicData>
+            </a:graphic>
+          </wp:inline>
+        </w:drawing>
+      </w:r>
+    </w:p>
+    <w:p>
+      <w:pPr>
+        <w:spacing w:after="240"/>
+        <w:jc w:val="center"/>
+      </w:pPr>
+      <w:r>
+        <w:rPr>
+          <w:b/>
+          <w:color w:val="4F5B6E"/>
+          <w:sz w:val="18"/>
+        </w:rPr>
+        <w:t xml:space="preserve">Figura 13. </w:t>
+      </w:r>
+      <w:r>
+        <w:rPr>
+          <w:color w:val="4F5B6E"/>
+          <w:sz w:val="18"/>
+        </w:rPr>
+        <w:t>Formulario de una campaña: datos, productos, hitos y participantes.</w:t>
       </w:r>
     </w:p>
     <w:p>
@@ -3600,6 +4432,130 @@
       </w:r>
     </w:p>
     <w:p>
+      <w:pPr>
+        <w:keepNext/>
+        <w:spacing w:before="160"/>
+        <w:jc w:val="center"/>
+      </w:pPr>
+      <w:r>
+        <w:drawing>
+          <wp:inline xmlns:a="http://schemas.openxmlformats.org/drawingml/2006/main" xmlns:pic="http://schemas.openxmlformats.org/drawingml/2006/picture">
+            <wp:extent cx="5760000" cy="3600000"/>
+            <wp:docPr id="15" name="Picture 15"/>
+            <wp:cNvGraphicFramePr>
+              <a:graphicFrameLocks noChangeAspect="1"/>
+            </wp:cNvGraphicFramePr>
+            <a:graphic>
+              <a:graphicData uri="http://schemas.openxmlformats.org/drawingml/2006/picture">
+                <pic:pic>
+                  <pic:nvPicPr>
+                    <pic:cNvPr id="0" name="13-admin-campanas.png"/>
+                    <pic:cNvPicPr/>
+                  </pic:nvPicPr>
+                  <pic:blipFill>
+                    <a:blip r:embed="rId25"/>
+                    <a:stretch>
+                      <a:fillRect/>
+                    </a:stretch>
+                  </pic:blipFill>
+                  <pic:spPr>
+                    <a:xfrm>
+                      <a:off x="0" y="0"/>
+                      <a:ext cx="5760000" cy="3600000"/>
+                    </a:xfrm>
+                    <a:prstGeom prst="rect"/>
+                  </pic:spPr>
+                </pic:pic>
+              </a:graphicData>
+            </a:graphic>
+          </wp:inline>
+        </w:drawing>
+      </w:r>
+    </w:p>
+    <w:p>
+      <w:pPr>
+        <w:spacing w:after="240"/>
+        <w:jc w:val="center"/>
+      </w:pPr>
+      <w:r>
+        <w:rPr>
+          <w:b/>
+          <w:color w:val="4F5B6E"/>
+          <w:sz w:val="18"/>
+        </w:rPr>
+        <w:t xml:space="preserve">Figura 14. </w:t>
+      </w:r>
+      <w:r>
+        <w:rPr>
+          <w:color w:val="4F5B6E"/>
+          <w:sz w:val="18"/>
+        </w:rPr>
+        <w:t>Lista de campañas con su estado.</w:t>
+      </w:r>
+    </w:p>
+    <w:p>
+      <w:pPr>
+        <w:keepNext/>
+        <w:spacing w:before="160"/>
+        <w:jc w:val="center"/>
+      </w:pPr>
+      <w:r>
+        <w:drawing>
+          <wp:inline xmlns:a="http://schemas.openxmlformats.org/drawingml/2006/main" xmlns:pic="http://schemas.openxmlformats.org/drawingml/2006/picture">
+            <wp:extent cx="5760000" cy="3600000"/>
+            <wp:docPr id="14" name="Picture 14"/>
+            <wp:cNvGraphicFramePr>
+              <a:graphicFrameLocks noChangeAspect="1"/>
+            </wp:cNvGraphicFramePr>
+            <a:graphic>
+              <a:graphicData uri="http://schemas.openxmlformats.org/drawingml/2006/picture">
+                <pic:pic>
+                  <pic:nvPicPr>
+                    <pic:cNvPr id="0" name="14-admin-campanas-acciones.png"/>
+                    <pic:cNvPicPr/>
+                  </pic:nvPicPr>
+                  <pic:blipFill>
+                    <a:blip r:embed="rId24"/>
+                    <a:stretch>
+                      <a:fillRect/>
+                    </a:stretch>
+                  </pic:blipFill>
+                  <pic:spPr>
+                    <a:xfrm>
+                      <a:off x="0" y="0"/>
+                      <a:ext cx="5760000" cy="3600000"/>
+                    </a:xfrm>
+                    <a:prstGeom prst="rect"/>
+                  </pic:spPr>
+                </pic:pic>
+              </a:graphicData>
+            </a:graphic>
+          </wp:inline>
+        </w:drawing>
+      </w:r>
+    </w:p>
+    <w:p>
+      <w:pPr>
+        <w:spacing w:after="240"/>
+        <w:jc w:val="center"/>
+      </w:pPr>
+      <w:r>
+        <w:rPr>
+          <w:b/>
+          <w:color w:val="4F5B6E"/>
+          <w:sz w:val="18"/>
+        </w:rPr>
+        <w:t xml:space="preserve">Figura 15. </w:t>
+      </w:r>
+      <w:r>
+        <w:rPr>
+          <w:color w:val="4F5B6E"/>
+          <w:sz w:val="18"/>
+        </w:rPr>
+        <w:t>Menú de acciones de una campaña.</w:t>
+      </w:r>
+    </w:p>
+    <w:p>
       <w:r>
         <w:br w:type="page"/>
       </w:r>
@@ -3845,6 +4801,68 @@
       <w:r>
         <w:rPr/>
         <w:t>Para que un usuario gane puntos, además de tener cuenta debe estar marcado como participante en la campaña.</w:t>
+      </w:r>
+    </w:p>
+    <w:p>
+      <w:pPr>
+        <w:keepNext/>
+        <w:spacing w:before="160"/>
+        <w:jc w:val="center"/>
+      </w:pPr>
+      <w:r>
+        <w:drawing>
+          <wp:inline xmlns:a="http://schemas.openxmlformats.org/drawingml/2006/main" xmlns:pic="http://schemas.openxmlformats.org/drawingml/2006/picture">
+            <wp:extent cx="5760000" cy="4341333"/>
+            <wp:docPr id="16" name="Picture 16"/>
+            <wp:cNvGraphicFramePr>
+              <a:graphicFrameLocks noChangeAspect="1"/>
+            </wp:cNvGraphicFramePr>
+            <a:graphic>
+              <a:graphicData uri="http://schemas.openxmlformats.org/drawingml/2006/picture">
+                <pic:pic>
+                  <pic:nvPicPr>
+                    <pic:cNvPr id="0" name="16-admin-usuarios.png"/>
+                    <pic:cNvPicPr/>
+                  </pic:nvPicPr>
+                  <pic:blipFill>
+                    <a:blip r:embed="rId26"/>
+                    <a:stretch>
+                      <a:fillRect/>
+                    </a:stretch>
+                  </pic:blipFill>
+                  <pic:spPr>
+                    <a:xfrm>
+                      <a:off x="0" y="0"/>
+                      <a:ext cx="5760000" cy="4341333"/>
+                    </a:xfrm>
+                    <a:prstGeom prst="rect"/>
+                  </pic:spPr>
+                </pic:pic>
+              </a:graphicData>
+            </a:graphic>
+          </wp:inline>
+        </w:drawing>
+      </w:r>
+    </w:p>
+    <w:p>
+      <w:pPr>
+        <w:spacing w:after="240"/>
+        <w:jc w:val="center"/>
+      </w:pPr>
+      <w:r>
+        <w:rPr>
+          <w:b/>
+          <w:color w:val="4F5B6E"/>
+          <w:sz w:val="18"/>
+        </w:rPr>
+        <w:t xml:space="preserve">Figura 16. </w:t>
+      </w:r>
+      <w:r>
+        <w:rPr>
+          <w:color w:val="4F5B6E"/>
+          <w:sz w:val="18"/>
+        </w:rPr>
+        <w:t>Gestión de usuarios e invitaciones.</w:t>
       </w:r>
     </w:p>
     <w:p>
@@ -4144,6 +5162,68 @@
     </w:tbl>
     <w:p>
       <w:pPr>
+        <w:keepNext/>
+        <w:spacing w:before="160"/>
+        <w:jc w:val="center"/>
+      </w:pPr>
+      <w:r>
+        <w:drawing>
+          <wp:inline xmlns:a="http://schemas.openxmlformats.org/drawingml/2006/main" xmlns:pic="http://schemas.openxmlformats.org/drawingml/2006/picture">
+            <wp:extent cx="5760000" cy="5000000"/>
+            <wp:docPr id="17" name="Picture 17"/>
+            <wp:cNvGraphicFramePr>
+              <a:graphicFrameLocks noChangeAspect="1"/>
+            </wp:cNvGraphicFramePr>
+            <a:graphic>
+              <a:graphicData uri="http://schemas.openxmlformats.org/drawingml/2006/picture">
+                <pic:pic>
+                  <pic:nvPicPr>
+                    <pic:cNvPr id="0" name="17-admin-comprobantes.png"/>
+                    <pic:cNvPicPr/>
+                  </pic:nvPicPr>
+                  <pic:blipFill>
+                    <a:blip r:embed="rId27"/>
+                    <a:stretch>
+                      <a:fillRect/>
+                    </a:stretch>
+                  </pic:blipFill>
+                  <pic:spPr>
+                    <a:xfrm>
+                      <a:off x="0" y="0"/>
+                      <a:ext cx="5760000" cy="5000000"/>
+                    </a:xfrm>
+                    <a:prstGeom prst="rect"/>
+                  </pic:spPr>
+                </pic:pic>
+              </a:graphicData>
+            </a:graphic>
+          </wp:inline>
+        </w:drawing>
+      </w:r>
+    </w:p>
+    <w:p>
+      <w:pPr>
+        <w:spacing w:after="240"/>
+        <w:jc w:val="center"/>
+      </w:pPr>
+      <w:r>
+        <w:rPr>
+          <w:b/>
+          <w:color w:val="4F5B6E"/>
+          <w:sz w:val="18"/>
+        </w:rPr>
+        <w:t xml:space="preserve">Figura 17. </w:t>
+      </w:r>
+      <w:r>
+        <w:rPr>
+          <w:color w:val="4F5B6E"/>
+          <w:sz w:val="18"/>
+        </w:rPr>
+        <w:t>Lista de comprobantes escaneados.</w:t>
+      </w:r>
+    </w:p>
+    <w:p>
+      <w:pPr>
         <w:spacing w:after="80"/>
       </w:pPr>
     </w:p>
@@ -4358,6 +5438,68 @@
       <w:r>
         <w:rPr/>
         <w:t>, y ese comprobante tampoco se podrá volver a subir.</w:t>
+      </w:r>
+    </w:p>
+    <w:p>
+      <w:pPr>
+        <w:keepNext/>
+        <w:spacing w:before="160"/>
+        <w:jc w:val="center"/>
+      </w:pPr>
+      <w:r>
+        <w:drawing>
+          <wp:inline xmlns:a="http://schemas.openxmlformats.org/drawingml/2006/main" xmlns:pic="http://schemas.openxmlformats.org/drawingml/2006/picture">
+            <wp:extent cx="5760000" cy="5349333"/>
+            <wp:docPr id="18" name="Picture 18"/>
+            <wp:cNvGraphicFramePr>
+              <a:graphicFrameLocks noChangeAspect="1"/>
+            </wp:cNvGraphicFramePr>
+            <a:graphic>
+              <a:graphicData uri="http://schemas.openxmlformats.org/drawingml/2006/picture">
+                <pic:pic>
+                  <pic:nvPicPr>
+                    <pic:cNvPr id="0" name="18-admin-comprobante-detalle.png"/>
+                    <pic:cNvPicPr/>
+                  </pic:nvPicPr>
+                  <pic:blipFill>
+                    <a:blip r:embed="rId28"/>
+                    <a:stretch>
+                      <a:fillRect/>
+                    </a:stretch>
+                  </pic:blipFill>
+                  <pic:spPr>
+                    <a:xfrm>
+                      <a:off x="0" y="0"/>
+                      <a:ext cx="5760000" cy="5349333"/>
+                    </a:xfrm>
+                    <a:prstGeom prst="rect"/>
+                  </pic:spPr>
+                </pic:pic>
+              </a:graphicData>
+            </a:graphic>
+          </wp:inline>
+        </w:drawing>
+      </w:r>
+    </w:p>
+    <w:p>
+      <w:pPr>
+        <w:spacing w:after="240"/>
+        <w:jc w:val="center"/>
+      </w:pPr>
+      <w:r>
+        <w:rPr>
+          <w:b/>
+          <w:color w:val="4F5B6E"/>
+          <w:sz w:val="18"/>
+        </w:rPr>
+        <w:t xml:space="preserve">Figura 18. </w:t>
+      </w:r>
+      <w:r>
+        <w:rPr>
+          <w:color w:val="4F5B6E"/>
+          <w:sz w:val="18"/>
+        </w:rPr>
+        <w:t>Detalle de un comprobante para revisar, con el formulario de anulación.</w:t>
       </w:r>
     </w:p>
     <w:p>
@@ -5793,6 +6935,11 @@
       </w:r>
     </w:p>
     <w:p>
+      <w:r>
+        <w:t>El detalle completo de arquitectura, API, datos, despliegue y operación está en el Manual técnico de la plataforma (Manual-Tecnico-Plataforma-OCR).</w:t>
+      </w:r>
+    </w:p>
+    <w:p>
       <w:pPr>
         <w:pStyle w:val="Heading2"/>
       </w:pPr>
@@ -7186,6 +8333,1502 @@
       </w:tr>
     </w:tbl>
     <w:p>
+      <w:r>
+        <w:br w:type="page"/>
+      </w:r>
+    </w:p>
+    <w:p>
+      <w:pPr>
+        <w:pStyle w:val="Heading1"/>
+      </w:pPr>
+      <w:r>
+        <w:rPr>
+          <w:color w:val="008AA8"/>
+        </w:rPr>
+        <w:t xml:space="preserve">15  </w:t>
+      </w:r>
+      <w:r>
+        <w:rPr/>
+        <w:t xml:space="preserve">Política de mitigación de riesgo del OCR</w:t>
+      </w:r>
+    </w:p>
+    <w:p>
+      <w:pPr>
+        <w:spacing w:after="120"/>
+      </w:pPr>
+      <w:r>
+        <w:rPr>
+          <w:sz w:val="23"/>
+        </w:rPr>
+        <w:t xml:space="preserve">Riesgos técnicos del pipeline de OCR — extracción de texto con Google Cloud Vision, validación del comprobante, emparejamiento de productos y otorgamiento de puntos — y las mitigaciones ya implementadas en el código. No cubre riesgos de negocio, legales ni de continuidad fuera del software.</w:t>
+      </w:r>
+    </w:p>
+    <w:p>
+      <w:pPr>
+        <w:pStyle w:val="Heading2"/>
+      </w:pPr>
+      <w:r>
+        <w:rPr/>
+        <w:t xml:space="preserve">Precisión del OCR (Google Cloud Vision)</w:t>
+      </w:r>
+    </w:p>
+    <w:p>
+      <w:pPr>
+        <w:spacing w:after="40"/>
+      </w:pPr>
+      <w:r>
+        <w:rPr/>
+        <w:t xml:space="preserve">• </w:t>
+      </w:r>
+      <w:r>
+        <w:rPr>
+          <w:b/>
+          <w:color w:val="0D4F8B"/>
+        </w:rPr>
+        <w:t xml:space="preserve">Ángulo y rotación. </w:t>
+      </w:r>
+      <w:r>
+        <w:rPr/>
+        <w:t xml:space="preserve">Fotos inclinadas: se corrige el ángulo medio de lectura, pero una perspectiva fuerte puede seguir mezclando columnas.</w:t>
+      </w:r>
+    </w:p>
+    <w:p>
+      <w:pPr>
+        <w:spacing w:after="40"/>
+      </w:pPr>
+      <w:r>
+        <w:rPr/>
+        <w:t xml:space="preserve">• </w:t>
+      </w:r>
+      <w:r>
+        <w:rPr>
+          <w:b/>
+          <w:color w:val="0D4F8B"/>
+        </w:rPr>
+        <w:t xml:space="preserve">Recibos borrosos o tinta desgastada. </w:t>
+      </w:r>
+      <w:r>
+        <w:rPr/>
+        <w:t xml:space="preserve">Vision puede devolver texto parcial sin marcarlo como error; el campo confidence no se usa para descartar lecturas de baja confianza.</w:t>
+      </w:r>
+    </w:p>
+    <w:p>
+      <w:pPr>
+        <w:spacing w:after="40"/>
+      </w:pPr>
+      <w:r>
+        <w:rPr/>
+        <w:t xml:space="preserve">• </w:t>
+      </w:r>
+      <w:r>
+        <w:rPr>
+          <w:b/>
+          <w:color w:val="0D4F8B"/>
+        </w:rPr>
+        <w:t xml:space="preserve">Confusión de columnas. </w:t>
+      </w:r>
+      <w:r>
+        <w:rPr/>
+        <w:t xml:space="preserve">La reconstrucción de filas por altura puede fusionar o separar líneas en recibos muy angostos o con tipografía variable.</w:t>
+      </w:r>
+    </w:p>
+    <w:p>
+      <w:pPr>
+        <w:spacing w:after="40"/>
+      </w:pPr>
+      <w:r>
+        <w:rPr/>
+        <w:t xml:space="preserve">• </w:t>
+      </w:r>
+      <w:r>
+        <w:rPr>
+          <w:b/>
+          <w:color w:val="0D4F8B"/>
+        </w:rPr>
+        <w:t xml:space="preserve">PDFs largos. </w:t>
+      </w:r>
+      <w:r>
+        <w:rPr/>
+        <w:t xml:space="preserve">Solo se leen las páginas 1 a 5 de un PDF; el resto se pierde sin aviso.</w:t>
+      </w:r>
+    </w:p>
+    <w:p>
+      <w:pPr>
+        <w:spacing w:after="40"/>
+      </w:pPr>
+      <w:r>
+        <w:rPr/>
+        <w:t xml:space="preserve">• </w:t>
+      </w:r>
+      <w:r>
+        <w:rPr>
+          <w:b/>
+          <w:color w:val="0D4F8B"/>
+        </w:rPr>
+        <w:t xml:space="preserve">Idioma y formato regional. </w:t>
+      </w:r>
+      <w:r>
+        <w:rPr/>
+        <w:t xml:space="preserve">Los patrones de fecha y monto asumen formato latino/español; otros formatos pueden no detectar fecha o total.</w:t>
+      </w:r>
+    </w:p>
+    <w:p>
+      <w:pPr>
+        <w:spacing w:after="40"/>
+      </w:pPr>
+      <w:r>
+        <w:rPr/>
+        <w:t xml:space="preserve">• </w:t>
+      </w:r>
+      <w:r>
+        <w:rPr>
+          <w:b/>
+          <w:color w:val="0D4F8B"/>
+        </w:rPr>
+        <w:t xml:space="preserve">Errores del servicio. </w:t>
+      </w:r>
+      <w:r>
+        <w:rPr/>
+        <w:t xml:space="preserve">Cualquier falla de Vision se devuelve como error 502 sin reintento automático.</w:t>
+      </w:r>
+    </w:p>
+    <w:p>
+      <w:pPr>
+        <w:pStyle w:val="Heading2"/>
+      </w:pPr>
+      <w:r>
+        <w:rPr/>
+        <w:t xml:space="preserve">Fraude y abuso del sistema de puntos</w:t>
+      </w:r>
+    </w:p>
+    <w:p>
+      <w:pPr>
+        <w:spacing w:after="40"/>
+      </w:pPr>
+      <w:r>
+        <w:rPr/>
+        <w:t xml:space="preserve">• </w:t>
+      </w:r>
+      <w:r>
+        <w:rPr>
+          <w:b/>
+          <w:color w:val="0D4F8B"/>
+        </w:rPr>
+        <w:t xml:space="preserve">Nota a mano como recibo. </w:t>
+      </w:r>
+      <w:r>
+        <w:rPr/>
+        <w:t xml:space="preserve">Mitigado: una línea solo cuenta si lleva un monto con dos decimales, y el recibo necesita TOTAL y fecha dentro de la campaña.</w:t>
+      </w:r>
+    </w:p>
+    <w:p>
+      <w:pPr>
+        <w:spacing w:after="40"/>
+      </w:pPr>
+      <w:r>
+        <w:rPr/>
+        <w:t xml:space="preserve">• </w:t>
+      </w:r>
+      <w:r>
+        <w:rPr>
+          <w:b/>
+          <w:color w:val="0D4F8B"/>
+        </w:rPr>
+        <w:t xml:space="preserve">Reenvío del mismo recibo. </w:t>
+      </w:r>
+      <w:r>
+        <w:rPr/>
+        <w:t xml:space="preserve">Mitigado con tres guardas (hash de archivo, hash de texto, identidad del recibo). Riesgo residual cuando no hay folio ni hora: la identidad de respaldo puede fallar en ambos sentidos.</w:t>
+      </w:r>
+    </w:p>
+    <w:p>
+      <w:pPr>
+        <w:spacing w:after="40"/>
+      </w:pPr>
+      <w:r>
+        <w:rPr/>
+        <w:t xml:space="preserve">• </w:t>
+      </w:r>
+      <w:r>
+        <w:rPr>
+          <w:b/>
+          <w:color w:val="0D4F8B"/>
+        </w:rPr>
+        <w:t xml:space="preserve">Doble cuenta. </w:t>
+      </w:r>
+      <w:r>
+        <w:rPr/>
+        <w:t xml:space="preserve">El límite diario es por cuenta, no por dispositivo; dos cuentas duplican la cuota, aunque el duplicado de recibo sí aplica globalmente.</w:t>
+      </w:r>
+    </w:p>
+    <w:p>
+      <w:pPr>
+        <w:spacing w:after="40"/>
+      </w:pPr>
+      <w:r>
+        <w:rPr/>
+        <w:t xml:space="preserve">• </w:t>
+      </w:r>
+      <w:r>
+        <w:rPr>
+          <w:b/>
+          <w:color w:val="0D4F8B"/>
+        </w:rPr>
+        <w:t xml:space="preserve">Sobre-conteo de unidades. </w:t>
+      </w:r>
+      <w:r>
+        <w:rPr/>
+        <w:t xml:space="preserve">Mitigado por diseño: cantidad ambigua cuenta 1 unidad, y RECEIPT_MAX_UNITS topa el total por recibo.</w:t>
+      </w:r>
+    </w:p>
+    <w:p>
+      <w:pPr>
+        <w:spacing w:after="40"/>
+      </w:pPr>
+      <w:r>
+        <w:rPr/>
+        <w:t xml:space="preserve">• </w:t>
+      </w:r>
+      <w:r>
+        <w:rPr>
+          <w:b/>
+          <w:color w:val="0D4F8B"/>
+        </w:rPr>
+        <w:t xml:space="preserve">Líneas sospechosas. </w:t>
+      </w:r>
+      <w:r>
+        <w:rPr/>
+        <w:t xml:space="preserve">No bloqueados, solo marcados para revisión manual (flags de cantidad alta y escaneo frecuente); el control depende de que un admin revise la cola.</w:t>
+      </w:r>
+    </w:p>
+    <w:p>
+      <w:pPr>
+        <w:spacing w:after="40"/>
+      </w:pPr>
+      <w:r>
+        <w:rPr/>
+        <w:t xml:space="preserve">• </w:t>
+      </w:r>
+      <w:r>
+        <w:rPr>
+          <w:b/>
+          <w:color w:val="0D4F8B"/>
+        </w:rPr>
+        <w:t xml:space="preserve">Abuso de rol admin. </w:t>
+      </w:r>
+      <w:r>
+        <w:rPr/>
+        <w:t xml:space="preserve">Mitigado por diseño: solo el rol user puede escanear; un admin no puede auto-otorgarse puntos.</w:t>
+      </w:r>
+    </w:p>
+    <w:p>
+      <w:pPr>
+        <w:pStyle w:val="Heading2"/>
+      </w:pPr>
+      <w:r>
+        <w:rPr/>
+        <w:t xml:space="preserve">Disponibilidad y dependencia de terceros</w:t>
+      </w:r>
+    </w:p>
+    <w:p>
+      <w:pPr>
+        <w:spacing w:after="40"/>
+      </w:pPr>
+      <w:r>
+        <w:rPr/>
+        <w:t xml:space="preserve">• </w:t>
+      </w:r>
+      <w:r>
+        <w:rPr>
+          <w:b/>
+          <w:color w:val="0D4F8B"/>
+        </w:rPr>
+        <w:t xml:space="preserve">Punto único de falla. </w:t>
+      </w:r>
+      <w:r>
+        <w:rPr/>
+        <w:t xml:space="preserve">No hay OCR alterno: si Vision cae, ningún escaneo puede procesarse.</w:t>
+      </w:r>
+    </w:p>
+    <w:p>
+      <w:pPr>
+        <w:spacing w:after="40"/>
+      </w:pPr>
+      <w:r>
+        <w:rPr/>
+        <w:t xml:space="preserve">• </w:t>
+      </w:r>
+      <w:r>
+        <w:rPr>
+          <w:b/>
+          <w:color w:val="0D4F8B"/>
+        </w:rPr>
+        <w:t xml:space="preserve">Costo por volumen. </w:t>
+      </w:r>
+      <w:r>
+        <w:rPr/>
+        <w:t xml:space="preserve">Cada intento de escaneo cuesta una llamada a Vision aunque no puntúe; un ataque de escaneos inválidos genera costo real.</w:t>
+      </w:r>
+    </w:p>
+    <w:p>
+      <w:pPr>
+        <w:spacing w:after="40"/>
+      </w:pPr>
+      <w:r>
+        <w:rPr/>
+        <w:t xml:space="preserve">• </w:t>
+      </w:r>
+      <w:r>
+        <w:rPr>
+          <w:b/>
+          <w:color w:val="0D4F8B"/>
+        </w:rPr>
+        <w:t xml:space="preserve">Límites de Cloud Run. </w:t>
+      </w:r>
+      <w:r>
+        <w:rPr/>
+        <w:t xml:space="preserve">--max-instances 3 puede saturarse en picos de uso simultáneo (cierre de campaña).</w:t>
+      </w:r>
+    </w:p>
+    <w:p>
+      <w:pPr>
+        <w:pStyle w:val="Heading2"/>
+      </w:pPr>
+      <w:r>
+        <w:rPr/>
+        <w:t xml:space="preserve">Seguridad y credenciales</w:t>
+      </w:r>
+    </w:p>
+    <w:p>
+      <w:pPr>
+        <w:spacing w:after="40"/>
+      </w:pPr>
+      <w:r>
+        <w:rPr/>
+        <w:t xml:space="preserve">• </w:t>
+      </w:r>
+      <w:r>
+        <w:rPr>
+          <w:b/>
+          <w:color w:val="0D4F8B"/>
+        </w:rPr>
+        <w:t xml:space="preserve">Llave de servicio local. </w:t>
+      </w:r>
+      <w:r>
+        <w:rPr/>
+        <w:t xml:space="preserve">Existe en server/serviceAccount.json, excluido del repositorio, pero sin rotación programada; una copia local expuesta da acceso total al proyecto.</w:t>
+      </w:r>
+    </w:p>
+    <w:p>
+      <w:pPr>
+        <w:spacing w:after="40"/>
+      </w:pPr>
+      <w:r>
+        <w:rPr/>
+        <w:t xml:space="preserve">• </w:t>
+      </w:r>
+      <w:r>
+        <w:rPr>
+          <w:b/>
+          <w:color w:val="0D4F8B"/>
+        </w:rPr>
+        <w:t xml:space="preserve">Despliegue en producción. </w:t>
+      </w:r>
+      <w:r>
+        <w:rPr/>
+        <w:t xml:space="preserve">En Cloud Run el servicio corre con identidad nativa de GCP, sin llave en la imagen — control ya aplicado correctamente.</w:t>
+      </w:r>
+    </w:p>
+    <w:p>
+      <w:pPr>
+        <w:spacing w:after="40"/>
+      </w:pPr>
+      <w:r>
+        <w:rPr/>
+        <w:t xml:space="preserve">• </w:t>
+      </w:r>
+      <w:r>
+        <w:rPr>
+          <w:b/>
+          <w:color w:val="0D4F8B"/>
+        </w:rPr>
+        <w:t xml:space="preserve">Evidencia en Cloud Storage. </w:t>
+      </w:r>
+      <w:r>
+        <w:rPr/>
+        <w:t xml:space="preserve">Las fotos de recibos pueden incluir datos personales o de tarjeta; dependen de las reglas de acceso del bucket configurado en FIREBASE_STORAGE_BUCKET.</w:t>
+      </w:r>
+    </w:p>
+    <w:p>
+      <w:pPr>
+        <w:pStyle w:val="Heading2"/>
+      </w:pPr>
+      <w:r>
+        <w:rPr/>
+        <w:t xml:space="preserve">Operación e infraestructura</w:t>
+      </w:r>
+    </w:p>
+    <w:tbl>
+      <w:tblPr>
+        <w:tblW w:type="auto" w:w="0"/>
+        <w:tblLook w:firstColumn="1" w:firstRow="1" w:lastColumn="0" w:lastRow="0" w:noHBand="0" w:noVBand="1" w:val="04A0"/>
+        <w:tblBorders>
+          <w:top w:val="single" w:sz="4" w:color="F0C98A"/>
+          <w:left w:val="single" w:sz="4" w:color="F0C98A"/>
+          <w:bottom w:val="single" w:sz="4" w:color="F0C98A"/>
+          <w:right w:val="single" w:sz="4" w:color="F0C98A"/>
+          <w:insideH w:val="single" w:sz="4" w:color="F0C98A"/>
+          <w:insideV w:val="single" w:sz="4" w:color="F0C98A"/>
+        </w:tblBorders>
+      </w:tblPr>
+      <w:tblGrid>
+        <w:gridCol w:w="9638"/>
+      </w:tblGrid>
+      <w:tr>
+        <w:tc>
+          <w:tcPr>
+            <w:tcW w:type="dxa" w:w="9638"/>
+            <w:shd w:val="clear" w:color="auto" w:fill="FDF1DE"/>
+          </w:tcPr>
+          <w:p>
+            <w:pPr>
+              <w:spacing w:after="60"/>
+            </w:pPr>
+            <w:r>
+              <w:rPr>
+                <w:b/>
+                <w:color w:val="18212F"/>
+              </w:rPr>
+              <w:t xml:space="preserve">Hallazgo crítico</w:t>
+            </w:r>
+          </w:p>
+          <w:p>
+            <w:pPr>
+              <w:spacing w:after="60"/>
+            </w:pPr>
+            <w:r>
+              <w:rPr/>
+              <w:t xml:space="preserve">Si el índice compuesto de firestore.indexes.json no está desplegado, el límite diario de escaneos (SCAN_DAILY_LIMIT) se desactiva silenciosamente — el código lo permite a propósito para no bloquear el servicio, y solo queda un console.error en el servidor. Un despliegue incompleto abre la puerta a abuso sin que nadie lo note.</w:t>
+            </w:r>
+          </w:p>
+        </w:tc>
+      </w:tr>
+    </w:tbl>
+    <w:p>
+      <w:pPr>
+        <w:spacing w:after="120"/>
+      </w:pPr>
+    </w:p>
+    <w:p>
+      <w:pPr>
+        <w:spacing w:after="40"/>
+      </w:pPr>
+      <w:r>
+        <w:rPr/>
+        <w:t xml:space="preserve">• </w:t>
+      </w:r>
+      <w:r>
+        <w:rPr>
+          <w:b/>
+          <w:color w:val="0D4F8B"/>
+        </w:rPr>
+        <w:t xml:space="preserve">Zona horaria no fijada. </w:t>
+      </w:r>
+      <w:r>
+        <w:rPr/>
+        <w:t xml:space="preserve">STATS_TIME_ZONE es opcional; vacío, el panel corta los días según la zona del servidor y puede desalinear las métricas.</w:t>
+      </w:r>
+    </w:p>
+    <w:p>
+      <w:pPr>
+        <w:spacing w:after="40"/>
+      </w:pPr>
+      <w:r>
+        <w:rPr/>
+        <w:t xml:space="preserve">• </w:t>
+      </w:r>
+      <w:r>
+        <w:rPr>
+          <w:b/>
+          <w:color w:val="0D4F8B"/>
+        </w:rPr>
+        <w:t xml:space="preserve">Atomicidad del puntaje. </w:t>
+      </w:r>
+      <w:r>
+        <w:rPr/>
+        <w:t xml:space="preserve">Todo el otorgamiento de puntos corre en una transacción de Firestore; si algo falla, la evidencia ya subida se borra — buen control existente.</w:t>
+      </w:r>
+    </w:p>
+    <w:p>
+      <w:pPr>
+        <w:pStyle w:val="Heading2"/>
+      </w:pPr>
+      <w:r>
+        <w:rPr/>
+        <w:t xml:space="preserve">Matriz de riesgo</w:t>
+      </w:r>
+    </w:p>
+    <w:tbl>
+      <w:tblPr>
+        <w:tblW w:type="auto" w:w="0"/>
+        <w:tblLook w:firstColumn="1" w:firstRow="1" w:lastColumn="0" w:lastRow="0" w:noHBand="0" w:noVBand="1" w:val="04A0"/>
+        <w:tblBorders>
+          <w:top w:val="single" w:sz="4" w:color="CFD8E3"/>
+          <w:left w:val="single" w:sz="4" w:color="CFD8E3"/>
+          <w:bottom w:val="single" w:sz="4" w:color="CFD8E3"/>
+          <w:right w:val="single" w:sz="4" w:color="CFD8E3"/>
+          <w:insideH w:val="single" w:sz="4" w:color="CFD8E3"/>
+          <w:insideV w:val="single" w:sz="4" w:color="CFD8E3"/>
+        </w:tblBorders>
+      </w:tblPr>
+      <w:tblGrid>
+        <w:gridCol w:w="4200"/>
+        <w:gridCol w:w="1500"/>
+        <w:gridCol w:w="1500"/>
+        <w:gridCol w:w="3400"/>
+      </w:tblGrid>
+      <w:tr>
+        <w:tc>
+          <w:tcPr>
+            <w:tcW w:type="dxa" w:w="4200"/>
+            <w:tcBorders>
+              <w:top w:val="single" w:sz="4" w:color="CFD8E3"/>
+              <w:left w:val="single" w:sz="4" w:color="CFD8E3"/>
+              <w:bottom w:val="single" w:sz="4" w:color="CFD8E3"/>
+              <w:right w:val="single" w:sz="4" w:color="CFD8E3"/>
+            </w:tcBorders>
+            <w:shd w:val="clear" w:color="auto" w:fill="EFEFEF"/>
+          </w:tcPr>
+          <w:p>
+            <w:pPr>
+              <w:spacing w:after="40"/>
+            </w:pPr>
+            <w:r>
+              <w:rPr>
+                <w:b/>
+                <w:color w:val="0D4F8B"/>
+                <w:sz w:val="19"/>
+              </w:rPr>
+              <w:t xml:space="preserve">Riesgo</w:t>
+            </w:r>
+          </w:p>
+        </w:tc>
+        <w:tc>
+          <w:tcPr>
+            <w:tcW w:type="dxa" w:w="1500"/>
+            <w:tcBorders>
+              <w:top w:val="single" w:sz="4" w:color="CFD8E3"/>
+              <w:left w:val="single" w:sz="4" w:color="CFD8E3"/>
+              <w:bottom w:val="single" w:sz="4" w:color="CFD8E3"/>
+              <w:right w:val="single" w:sz="4" w:color="CFD8E3"/>
+            </w:tcBorders>
+            <w:shd w:val="clear" w:color="auto" w:fill="EFEFEF"/>
+          </w:tcPr>
+          <w:p>
+            <w:pPr>
+              <w:spacing w:after="40"/>
+            </w:pPr>
+            <w:r>
+              <w:rPr>
+                <w:b/>
+                <w:color w:val="0D4F8B"/>
+                <w:sz w:val="19"/>
+              </w:rPr>
+              <w:t xml:space="preserve">Probabilidad</w:t>
+            </w:r>
+          </w:p>
+        </w:tc>
+        <w:tc>
+          <w:tcPr>
+            <w:tcW w:type="dxa" w:w="1500"/>
+            <w:tcBorders>
+              <w:top w:val="single" w:sz="4" w:color="CFD8E3"/>
+              <w:left w:val="single" w:sz="4" w:color="CFD8E3"/>
+              <w:bottom w:val="single" w:sz="4" w:color="CFD8E3"/>
+              <w:right w:val="single" w:sz="4" w:color="CFD8E3"/>
+            </w:tcBorders>
+            <w:shd w:val="clear" w:color="auto" w:fill="EFEFEF"/>
+          </w:tcPr>
+          <w:p>
+            <w:pPr>
+              <w:spacing w:after="40"/>
+            </w:pPr>
+            <w:r>
+              <w:rPr>
+                <w:b/>
+                <w:color w:val="0D4F8B"/>
+                <w:sz w:val="19"/>
+              </w:rPr>
+              <w:t xml:space="preserve">Impacto</w:t>
+            </w:r>
+          </w:p>
+        </w:tc>
+        <w:tc>
+          <w:tcPr>
+            <w:tcW w:type="dxa" w:w="3400"/>
+            <w:tcBorders>
+              <w:top w:val="single" w:sz="4" w:color="CFD8E3"/>
+              <w:left w:val="single" w:sz="4" w:color="CFD8E3"/>
+              <w:bottom w:val="single" w:sz="4" w:color="CFD8E3"/>
+              <w:right w:val="single" w:sz="4" w:color="CFD8E3"/>
+            </w:tcBorders>
+            <w:shd w:val="clear" w:color="auto" w:fill="EFEFEF"/>
+          </w:tcPr>
+          <w:p>
+            <w:pPr>
+              <w:spacing w:after="40"/>
+            </w:pPr>
+            <w:r>
+              <w:rPr>
+                <w:b/>
+                <w:color w:val="0D4F8B"/>
+                <w:sz w:val="19"/>
+              </w:rPr>
+              <w:t xml:space="preserve">Mitigación vigente</w:t>
+            </w:r>
+          </w:p>
+        </w:tc>
+      </w:tr>
+      <w:tr>
+        <w:tc>
+          <w:tcPr>
+            <w:tcW w:type="dxa" w:w="4200"/>
+            <w:tcBorders>
+              <w:top w:val="single" w:sz="4" w:color="CFD8E3"/>
+              <w:left w:val="single" w:sz="4" w:color="CFD8E3"/>
+              <w:bottom w:val="single" w:sz="4" w:color="CFD8E3"/>
+              <w:right w:val="single" w:sz="4" w:color="CFD8E3"/>
+            </w:tcBorders>
+          </w:tcPr>
+          <w:p>
+            <w:pPr>
+              <w:spacing w:after="40"/>
+            </w:pPr>
+            <w:r>
+              <w:rPr>
+                <w:sz w:val="19"/>
+              </w:rPr>
+              <w:t xml:space="preserve">Índice de Firestore no desplegado → límite diario queda desactivado</w:t>
+            </w:r>
+          </w:p>
+        </w:tc>
+        <w:tc>
+          <w:tcPr>
+            <w:tcW w:type="dxa" w:w="1500"/>
+            <w:tcBorders>
+              <w:top w:val="single" w:sz="4" w:color="CFD8E3"/>
+              <w:left w:val="single" w:sz="4" w:color="CFD8E3"/>
+              <w:bottom w:val="single" w:sz="4" w:color="CFD8E3"/>
+              <w:right w:val="single" w:sz="4" w:color="CFD8E3"/>
+            </w:tcBorders>
+          </w:tcPr>
+          <w:p>
+            <w:pPr>
+              <w:spacing w:after="40"/>
+            </w:pPr>
+            <w:r>
+              <w:rPr>
+                <w:sz w:val="19"/>
+              </w:rPr>
+              <w:t xml:space="preserve">Media</w:t>
+            </w:r>
+          </w:p>
+        </w:tc>
+        <w:tc>
+          <w:tcPr>
+            <w:tcW w:type="dxa" w:w="1500"/>
+            <w:tcBorders>
+              <w:top w:val="single" w:sz="4" w:color="CFD8E3"/>
+              <w:left w:val="single" w:sz="4" w:color="CFD8E3"/>
+              <w:bottom w:val="single" w:sz="4" w:color="CFD8E3"/>
+              <w:right w:val="single" w:sz="4" w:color="CFD8E3"/>
+            </w:tcBorders>
+          </w:tcPr>
+          <w:p>
+            <w:pPr>
+              <w:spacing w:after="40"/>
+            </w:pPr>
+            <w:r>
+              <w:rPr>
+                <w:sz w:val="19"/>
+              </w:rPr>
+              <w:t xml:space="preserve">Alto</w:t>
+            </w:r>
+          </w:p>
+        </w:tc>
+        <w:tc>
+          <w:tcPr>
+            <w:tcW w:type="dxa" w:w="3400"/>
+            <w:tcBorders>
+              <w:top w:val="single" w:sz="4" w:color="CFD8E3"/>
+              <w:left w:val="single" w:sz="4" w:color="CFD8E3"/>
+              <w:bottom w:val="single" w:sz="4" w:color="CFD8E3"/>
+              <w:right w:val="single" w:sz="4" w:color="CFD8E3"/>
+            </w:tcBorders>
+          </w:tcPr>
+          <w:p>
+            <w:pPr>
+              <w:spacing w:after="40"/>
+            </w:pPr>
+            <w:r>
+              <w:rPr>
+                <w:sz w:val="19"/>
+              </w:rPr>
+              <w:t xml:space="preserve">Ninguna automática; solo se registra en logs del servidor</w:t>
+            </w:r>
+          </w:p>
+        </w:tc>
+      </w:tr>
+      <w:tr>
+        <w:tc>
+          <w:tcPr>
+            <w:tcW w:type="dxa" w:w="4200"/>
+            <w:tcBorders>
+              <w:top w:val="single" w:sz="4" w:color="CFD8E3"/>
+              <w:left w:val="single" w:sz="4" w:color="CFD8E3"/>
+              <w:bottom w:val="single" w:sz="4" w:color="CFD8E3"/>
+              <w:right w:val="single" w:sz="4" w:color="CFD8E3"/>
+            </w:tcBorders>
+          </w:tcPr>
+          <w:p>
+            <w:pPr>
+              <w:spacing w:after="40"/>
+            </w:pPr>
+            <w:r>
+              <w:rPr>
+                <w:sz w:val="19"/>
+              </w:rPr>
+              <w:t xml:space="preserve">Caída o error de Google Cloud Vision (sin OCR alterno)</w:t>
+            </w:r>
+          </w:p>
+        </w:tc>
+        <w:tc>
+          <w:tcPr>
+            <w:tcW w:type="dxa" w:w="1500"/>
+            <w:tcBorders>
+              <w:top w:val="single" w:sz="4" w:color="CFD8E3"/>
+              <w:left w:val="single" w:sz="4" w:color="CFD8E3"/>
+              <w:bottom w:val="single" w:sz="4" w:color="CFD8E3"/>
+              <w:right w:val="single" w:sz="4" w:color="CFD8E3"/>
+            </w:tcBorders>
+          </w:tcPr>
+          <w:p>
+            <w:pPr>
+              <w:spacing w:after="40"/>
+            </w:pPr>
+            <w:r>
+              <w:rPr>
+                <w:sz w:val="19"/>
+              </w:rPr>
+              <w:t xml:space="preserve">Baja</w:t>
+            </w:r>
+          </w:p>
+        </w:tc>
+        <w:tc>
+          <w:tcPr>
+            <w:tcW w:type="dxa" w:w="1500"/>
+            <w:tcBorders>
+              <w:top w:val="single" w:sz="4" w:color="CFD8E3"/>
+              <w:left w:val="single" w:sz="4" w:color="CFD8E3"/>
+              <w:bottom w:val="single" w:sz="4" w:color="CFD8E3"/>
+              <w:right w:val="single" w:sz="4" w:color="CFD8E3"/>
+            </w:tcBorders>
+          </w:tcPr>
+          <w:p>
+            <w:pPr>
+              <w:spacing w:after="40"/>
+            </w:pPr>
+            <w:r>
+              <w:rPr>
+                <w:sz w:val="19"/>
+              </w:rPr>
+              <w:t xml:space="preserve">Alto</w:t>
+            </w:r>
+          </w:p>
+        </w:tc>
+        <w:tc>
+          <w:tcPr>
+            <w:tcW w:type="dxa" w:w="3400"/>
+            <w:tcBorders>
+              <w:top w:val="single" w:sz="4" w:color="CFD8E3"/>
+              <w:left w:val="single" w:sz="4" w:color="CFD8E3"/>
+              <w:bottom w:val="single" w:sz="4" w:color="CFD8E3"/>
+              <w:right w:val="single" w:sz="4" w:color="CFD8E3"/>
+            </w:tcBorders>
+          </w:tcPr>
+          <w:p>
+            <w:pPr>
+              <w:spacing w:after="40"/>
+            </w:pPr>
+            <w:r>
+              <w:rPr>
+                <w:sz w:val="19"/>
+              </w:rPr>
+              <w:t xml:space="preserve">Ninguna; el escaneo falla con HTTP 502, sin reintento</w:t>
+            </w:r>
+          </w:p>
+        </w:tc>
+      </w:tr>
+      <w:tr>
+        <w:tc>
+          <w:tcPr>
+            <w:tcW w:type="dxa" w:w="4200"/>
+            <w:tcBorders>
+              <w:top w:val="single" w:sz="4" w:color="CFD8E3"/>
+              <w:left w:val="single" w:sz="4" w:color="CFD8E3"/>
+              <w:bottom w:val="single" w:sz="4" w:color="CFD8E3"/>
+              <w:right w:val="single" w:sz="4" w:color="CFD8E3"/>
+            </w:tcBorders>
+          </w:tcPr>
+          <w:p>
+            <w:pPr>
+              <w:spacing w:after="40"/>
+            </w:pPr>
+            <w:r>
+              <w:rPr>
+                <w:sz w:val="19"/>
+              </w:rPr>
+              <w:t xml:space="preserve">Fotos borrosas, mal iluminadas o PDFs de más de 5 páginas</w:t>
+            </w:r>
+          </w:p>
+        </w:tc>
+        <w:tc>
+          <w:tcPr>
+            <w:tcW w:type="dxa" w:w="1500"/>
+            <w:tcBorders>
+              <w:top w:val="single" w:sz="4" w:color="CFD8E3"/>
+              <w:left w:val="single" w:sz="4" w:color="CFD8E3"/>
+              <w:bottom w:val="single" w:sz="4" w:color="CFD8E3"/>
+              <w:right w:val="single" w:sz="4" w:color="CFD8E3"/>
+            </w:tcBorders>
+          </w:tcPr>
+          <w:p>
+            <w:pPr>
+              <w:spacing w:after="40"/>
+            </w:pPr>
+            <w:r>
+              <w:rPr>
+                <w:sz w:val="19"/>
+              </w:rPr>
+              <w:t xml:space="preserve">Alta</w:t>
+            </w:r>
+          </w:p>
+        </w:tc>
+        <w:tc>
+          <w:tcPr>
+            <w:tcW w:type="dxa" w:w="1500"/>
+            <w:tcBorders>
+              <w:top w:val="single" w:sz="4" w:color="CFD8E3"/>
+              <w:left w:val="single" w:sz="4" w:color="CFD8E3"/>
+              <w:bottom w:val="single" w:sz="4" w:color="CFD8E3"/>
+              <w:right w:val="single" w:sz="4" w:color="CFD8E3"/>
+            </w:tcBorders>
+          </w:tcPr>
+          <w:p>
+            <w:pPr>
+              <w:spacing w:after="40"/>
+            </w:pPr>
+            <w:r>
+              <w:rPr>
+                <w:sz w:val="19"/>
+              </w:rPr>
+              <w:t xml:space="preserve">Medio</w:t>
+            </w:r>
+          </w:p>
+        </w:tc>
+        <w:tc>
+          <w:tcPr>
+            <w:tcW w:type="dxa" w:w="3400"/>
+            <w:tcBorders>
+              <w:top w:val="single" w:sz="4" w:color="CFD8E3"/>
+              <w:left w:val="single" w:sz="4" w:color="CFD8E3"/>
+              <w:bottom w:val="single" w:sz="4" w:color="CFD8E3"/>
+              <w:right w:val="single" w:sz="4" w:color="CFD8E3"/>
+            </w:tcBorders>
+          </w:tcPr>
+          <w:p>
+            <w:pPr>
+              <w:spacing w:after="40"/>
+            </w:pPr>
+            <w:r>
+              <w:rPr>
+                <w:sz w:val="19"/>
+              </w:rPr>
+              <w:t xml:space="preserve">Parcial: reconstrucción de filas, pero no usa el confidence de Vision</w:t>
+            </w:r>
+          </w:p>
+        </w:tc>
+      </w:tr>
+      <w:tr>
+        <w:tc>
+          <w:tcPr>
+            <w:tcW w:type="dxa" w:w="4200"/>
+            <w:tcBorders>
+              <w:top w:val="single" w:sz="4" w:color="CFD8E3"/>
+              <w:left w:val="single" w:sz="4" w:color="CFD8E3"/>
+              <w:bottom w:val="single" w:sz="4" w:color="CFD8E3"/>
+              <w:right w:val="single" w:sz="4" w:color="CFD8E3"/>
+            </w:tcBorders>
+          </w:tcPr>
+          <w:p>
+            <w:pPr>
+              <w:spacing w:after="40"/>
+            </w:pPr>
+            <w:r>
+              <w:rPr>
+                <w:sz w:val="19"/>
+              </w:rPr>
+              <w:t xml:space="preserve">Recibo reenviado cuando la identidad de respaldo es ambigua (sin folio ni hora)</w:t>
+            </w:r>
+          </w:p>
+        </w:tc>
+        <w:tc>
+          <w:tcPr>
+            <w:tcW w:type="dxa" w:w="1500"/>
+            <w:tcBorders>
+              <w:top w:val="single" w:sz="4" w:color="CFD8E3"/>
+              <w:left w:val="single" w:sz="4" w:color="CFD8E3"/>
+              <w:bottom w:val="single" w:sz="4" w:color="CFD8E3"/>
+              <w:right w:val="single" w:sz="4" w:color="CFD8E3"/>
+            </w:tcBorders>
+          </w:tcPr>
+          <w:p>
+            <w:pPr>
+              <w:spacing w:after="40"/>
+            </w:pPr>
+            <w:r>
+              <w:rPr>
+                <w:sz w:val="19"/>
+              </w:rPr>
+              <w:t xml:space="preserve">Baja</w:t>
+            </w:r>
+          </w:p>
+        </w:tc>
+        <w:tc>
+          <w:tcPr>
+            <w:tcW w:type="dxa" w:w="1500"/>
+            <w:tcBorders>
+              <w:top w:val="single" w:sz="4" w:color="CFD8E3"/>
+              <w:left w:val="single" w:sz="4" w:color="CFD8E3"/>
+              <w:bottom w:val="single" w:sz="4" w:color="CFD8E3"/>
+              <w:right w:val="single" w:sz="4" w:color="CFD8E3"/>
+            </w:tcBorders>
+          </w:tcPr>
+          <w:p>
+            <w:pPr>
+              <w:spacing w:after="40"/>
+            </w:pPr>
+            <w:r>
+              <w:rPr>
+                <w:sz w:val="19"/>
+              </w:rPr>
+              <w:t xml:space="preserve">Medio</w:t>
+            </w:r>
+          </w:p>
+        </w:tc>
+        <w:tc>
+          <w:tcPr>
+            <w:tcW w:type="dxa" w:w="3400"/>
+            <w:tcBorders>
+              <w:top w:val="single" w:sz="4" w:color="CFD8E3"/>
+              <w:left w:val="single" w:sz="4" w:color="CFD8E3"/>
+              <w:bottom w:val="single" w:sz="4" w:color="CFD8E3"/>
+              <w:right w:val="single" w:sz="4" w:color="CFD8E3"/>
+            </w:tcBorders>
+          </w:tcPr>
+          <w:p>
+            <w:pPr>
+              <w:spacing w:after="40"/>
+            </w:pPr>
+            <w:r>
+              <w:rPr>
+                <w:sz w:val="19"/>
+              </w:rPr>
+              <w:t xml:space="preserve">Parcial: 3 guardas de duplicado, pero la identidad de respaldo puede fallar en ambos sentidos</w:t>
+            </w:r>
+          </w:p>
+        </w:tc>
+      </w:tr>
+      <w:tr>
+        <w:tc>
+          <w:tcPr>
+            <w:tcW w:type="dxa" w:w="4200"/>
+            <w:tcBorders>
+              <w:top w:val="single" w:sz="4" w:color="CFD8E3"/>
+              <w:left w:val="single" w:sz="4" w:color="CFD8E3"/>
+              <w:bottom w:val="single" w:sz="4" w:color="CFD8E3"/>
+              <w:right w:val="single" w:sz="4" w:color="CFD8E3"/>
+            </w:tcBorders>
+          </w:tcPr>
+          <w:p>
+            <w:pPr>
+              <w:spacing w:after="40"/>
+            </w:pPr>
+            <w:r>
+              <w:rPr>
+                <w:sz w:val="19"/>
+              </w:rPr>
+              <w:t xml:space="preserve">Doble cuenta para duplicar la cuota diaria de escaneos</w:t>
+            </w:r>
+          </w:p>
+        </w:tc>
+        <w:tc>
+          <w:tcPr>
+            <w:tcW w:type="dxa" w:w="1500"/>
+            <w:tcBorders>
+              <w:top w:val="single" w:sz="4" w:color="CFD8E3"/>
+              <w:left w:val="single" w:sz="4" w:color="CFD8E3"/>
+              <w:bottom w:val="single" w:sz="4" w:color="CFD8E3"/>
+              <w:right w:val="single" w:sz="4" w:color="CFD8E3"/>
+            </w:tcBorders>
+          </w:tcPr>
+          <w:p>
+            <w:pPr>
+              <w:spacing w:after="40"/>
+            </w:pPr>
+            <w:r>
+              <w:rPr>
+                <w:sz w:val="19"/>
+              </w:rPr>
+              <w:t xml:space="preserve">Media</w:t>
+            </w:r>
+          </w:p>
+        </w:tc>
+        <w:tc>
+          <w:tcPr>
+            <w:tcW w:type="dxa" w:w="1500"/>
+            <w:tcBorders>
+              <w:top w:val="single" w:sz="4" w:color="CFD8E3"/>
+              <w:left w:val="single" w:sz="4" w:color="CFD8E3"/>
+              <w:bottom w:val="single" w:sz="4" w:color="CFD8E3"/>
+              <w:right w:val="single" w:sz="4" w:color="CFD8E3"/>
+            </w:tcBorders>
+          </w:tcPr>
+          <w:p>
+            <w:pPr>
+              <w:spacing w:after="40"/>
+            </w:pPr>
+            <w:r>
+              <w:rPr>
+                <w:sz w:val="19"/>
+              </w:rPr>
+              <w:t xml:space="preserve">Bajo/Medio</w:t>
+            </w:r>
+          </w:p>
+        </w:tc>
+        <w:tc>
+          <w:tcPr>
+            <w:tcW w:type="dxa" w:w="3400"/>
+            <w:tcBorders>
+              <w:top w:val="single" w:sz="4" w:color="CFD8E3"/>
+              <w:left w:val="single" w:sz="4" w:color="CFD8E3"/>
+              <w:bottom w:val="single" w:sz="4" w:color="CFD8E3"/>
+              <w:right w:val="single" w:sz="4" w:color="CFD8E3"/>
+            </w:tcBorders>
+          </w:tcPr>
+          <w:p>
+            <w:pPr>
+              <w:spacing w:after="40"/>
+            </w:pPr>
+            <w:r>
+              <w:rPr>
+                <w:sz w:val="19"/>
+              </w:rPr>
+              <w:t xml:space="preserve">Parcial: el duplicado de recibo es global, la cuota es por cuenta</w:t>
+            </w:r>
+          </w:p>
+        </w:tc>
+      </w:tr>
+      <w:tr>
+        <w:tc>
+          <w:tcPr>
+            <w:tcW w:type="dxa" w:w="4200"/>
+            <w:tcBorders>
+              <w:top w:val="single" w:sz="4" w:color="CFD8E3"/>
+              <w:left w:val="single" w:sz="4" w:color="CFD8E3"/>
+              <w:bottom w:val="single" w:sz="4" w:color="CFD8E3"/>
+              <w:right w:val="single" w:sz="4" w:color="CFD8E3"/>
+            </w:tcBorders>
+          </w:tcPr>
+          <w:p>
+            <w:pPr>
+              <w:spacing w:after="40"/>
+            </w:pPr>
+            <w:r>
+              <w:rPr>
+                <w:sz w:val="19"/>
+              </w:rPr>
+              <w:t xml:space="preserve">Exposición de server/serviceAccount.json fuera del repositorio</w:t>
+            </w:r>
+          </w:p>
+        </w:tc>
+        <w:tc>
+          <w:tcPr>
+            <w:tcW w:type="dxa" w:w="1500"/>
+            <w:tcBorders>
+              <w:top w:val="single" w:sz="4" w:color="CFD8E3"/>
+              <w:left w:val="single" w:sz="4" w:color="CFD8E3"/>
+              <w:bottom w:val="single" w:sz="4" w:color="CFD8E3"/>
+              <w:right w:val="single" w:sz="4" w:color="CFD8E3"/>
+            </w:tcBorders>
+          </w:tcPr>
+          <w:p>
+            <w:pPr>
+              <w:spacing w:after="40"/>
+            </w:pPr>
+            <w:r>
+              <w:rPr>
+                <w:sz w:val="19"/>
+              </w:rPr>
+              <w:t xml:space="preserve">Baja</w:t>
+            </w:r>
+          </w:p>
+        </w:tc>
+        <w:tc>
+          <w:tcPr>
+            <w:tcW w:type="dxa" w:w="1500"/>
+            <w:tcBorders>
+              <w:top w:val="single" w:sz="4" w:color="CFD8E3"/>
+              <w:left w:val="single" w:sz="4" w:color="CFD8E3"/>
+              <w:bottom w:val="single" w:sz="4" w:color="CFD8E3"/>
+              <w:right w:val="single" w:sz="4" w:color="CFD8E3"/>
+            </w:tcBorders>
+          </w:tcPr>
+          <w:p>
+            <w:pPr>
+              <w:spacing w:after="40"/>
+            </w:pPr>
+            <w:r>
+              <w:rPr>
+                <w:sz w:val="19"/>
+              </w:rPr>
+              <w:t xml:space="preserve">Alto</w:t>
+            </w:r>
+          </w:p>
+        </w:tc>
+        <w:tc>
+          <w:tcPr>
+            <w:tcW w:type="dxa" w:w="3400"/>
+            <w:tcBorders>
+              <w:top w:val="single" w:sz="4" w:color="CFD8E3"/>
+              <w:left w:val="single" w:sz="4" w:color="CFD8E3"/>
+              <w:bottom w:val="single" w:sz="4" w:color="CFD8E3"/>
+              <w:right w:val="single" w:sz="4" w:color="CFD8E3"/>
+            </w:tcBorders>
+          </w:tcPr>
+          <w:p>
+            <w:pPr>
+              <w:spacing w:after="40"/>
+            </w:pPr>
+            <w:r>
+              <w:rPr>
+                <w:sz w:val="19"/>
+              </w:rPr>
+              <w:t xml:space="preserve">Parcial: excluido del repositorio (.gitignore), sin rotación programada</w:t>
+            </w:r>
+          </w:p>
+        </w:tc>
+      </w:tr>
+      <w:tr>
+        <w:tc>
+          <w:tcPr>
+            <w:tcW w:type="dxa" w:w="4200"/>
+            <w:tcBorders>
+              <w:top w:val="single" w:sz="4" w:color="CFD8E3"/>
+              <w:left w:val="single" w:sz="4" w:color="CFD8E3"/>
+              <w:bottom w:val="single" w:sz="4" w:color="CFD8E3"/>
+              <w:right w:val="single" w:sz="4" w:color="CFD8E3"/>
+            </w:tcBorders>
+          </w:tcPr>
+          <w:p>
+            <w:pPr>
+              <w:spacing w:after="40"/>
+            </w:pPr>
+            <w:r>
+              <w:rPr>
+                <w:sz w:val="19"/>
+              </w:rPr>
+              <w:t xml:space="preserve">Saturación de Cloud Run en picos de uso (cierre de campaña)</w:t>
+            </w:r>
+          </w:p>
+        </w:tc>
+        <w:tc>
+          <w:tcPr>
+            <w:tcW w:type="dxa" w:w="1500"/>
+            <w:tcBorders>
+              <w:top w:val="single" w:sz="4" w:color="CFD8E3"/>
+              <w:left w:val="single" w:sz="4" w:color="CFD8E3"/>
+              <w:bottom w:val="single" w:sz="4" w:color="CFD8E3"/>
+              <w:right w:val="single" w:sz="4" w:color="CFD8E3"/>
+            </w:tcBorders>
+          </w:tcPr>
+          <w:p>
+            <w:pPr>
+              <w:spacing w:after="40"/>
+            </w:pPr>
+            <w:r>
+              <w:rPr>
+                <w:sz w:val="19"/>
+              </w:rPr>
+              <w:t xml:space="preserve">Media</w:t>
+            </w:r>
+          </w:p>
+        </w:tc>
+        <w:tc>
+          <w:tcPr>
+            <w:tcW w:type="dxa" w:w="1500"/>
+            <w:tcBorders>
+              <w:top w:val="single" w:sz="4" w:color="CFD8E3"/>
+              <w:left w:val="single" w:sz="4" w:color="CFD8E3"/>
+              <w:bottom w:val="single" w:sz="4" w:color="CFD8E3"/>
+              <w:right w:val="single" w:sz="4" w:color="CFD8E3"/>
+            </w:tcBorders>
+          </w:tcPr>
+          <w:p>
+            <w:pPr>
+              <w:spacing w:after="40"/>
+            </w:pPr>
+            <w:r>
+              <w:rPr>
+                <w:sz w:val="19"/>
+              </w:rPr>
+              <w:t xml:space="preserve">Medio</w:t>
+            </w:r>
+          </w:p>
+        </w:tc>
+        <w:tc>
+          <w:tcPr>
+            <w:tcW w:type="dxa" w:w="3400"/>
+            <w:tcBorders>
+              <w:top w:val="single" w:sz="4" w:color="CFD8E3"/>
+              <w:left w:val="single" w:sz="4" w:color="CFD8E3"/>
+              <w:bottom w:val="single" w:sz="4" w:color="CFD8E3"/>
+              <w:right w:val="single" w:sz="4" w:color="CFD8E3"/>
+            </w:tcBorders>
+          </w:tcPr>
+          <w:p>
+            <w:pPr>
+              <w:spacing w:after="40"/>
+            </w:pPr>
+            <w:r>
+              <w:rPr>
+                <w:sz w:val="19"/>
+              </w:rPr>
+              <w:t xml:space="preserve">Parcial: --max-instances 3, sin autoescalado adicional configurado</w:t>
+            </w:r>
+          </w:p>
+        </w:tc>
+      </w:tr>
+      <w:tr>
+        <w:tc>
+          <w:tcPr>
+            <w:tcW w:type="dxa" w:w="4200"/>
+            <w:tcBorders>
+              <w:top w:val="single" w:sz="4" w:color="CFD8E3"/>
+              <w:left w:val="single" w:sz="4" w:color="CFD8E3"/>
+              <w:bottom w:val="single" w:sz="4" w:color="CFD8E3"/>
+              <w:right w:val="single" w:sz="4" w:color="CFD8E3"/>
+            </w:tcBorders>
+          </w:tcPr>
+          <w:p>
+            <w:pPr>
+              <w:spacing w:after="40"/>
+            </w:pPr>
+            <w:r>
+              <w:rPr>
+                <w:sz w:val="19"/>
+              </w:rPr>
+              <w:t xml:space="preserve">Zona horaria de estadísticas (STATS_TIME_ZONE) sin fijar</w:t>
+            </w:r>
+          </w:p>
+        </w:tc>
+        <w:tc>
+          <w:tcPr>
+            <w:tcW w:type="dxa" w:w="1500"/>
+            <w:tcBorders>
+              <w:top w:val="single" w:sz="4" w:color="CFD8E3"/>
+              <w:left w:val="single" w:sz="4" w:color="CFD8E3"/>
+              <w:bottom w:val="single" w:sz="4" w:color="CFD8E3"/>
+              <w:right w:val="single" w:sz="4" w:color="CFD8E3"/>
+            </w:tcBorders>
+          </w:tcPr>
+          <w:p>
+            <w:pPr>
+              <w:spacing w:after="40"/>
+            </w:pPr>
+            <w:r>
+              <w:rPr>
+                <w:sz w:val="19"/>
+              </w:rPr>
+              <w:t xml:space="preserve">Media</w:t>
+            </w:r>
+          </w:p>
+        </w:tc>
+        <w:tc>
+          <w:tcPr>
+            <w:tcW w:type="dxa" w:w="1500"/>
+            <w:tcBorders>
+              <w:top w:val="single" w:sz="4" w:color="CFD8E3"/>
+              <w:left w:val="single" w:sz="4" w:color="CFD8E3"/>
+              <w:bottom w:val="single" w:sz="4" w:color="CFD8E3"/>
+              <w:right w:val="single" w:sz="4" w:color="CFD8E3"/>
+            </w:tcBorders>
+          </w:tcPr>
+          <w:p>
+            <w:pPr>
+              <w:spacing w:after="40"/>
+            </w:pPr>
+            <w:r>
+              <w:rPr>
+                <w:sz w:val="19"/>
+              </w:rPr>
+              <w:t xml:space="preserve">Bajo</w:t>
+            </w:r>
+          </w:p>
+        </w:tc>
+        <w:tc>
+          <w:tcPr>
+            <w:tcW w:type="dxa" w:w="3400"/>
+            <w:tcBorders>
+              <w:top w:val="single" w:sz="4" w:color="CFD8E3"/>
+              <w:left w:val="single" w:sz="4" w:color="CFD8E3"/>
+              <w:bottom w:val="single" w:sz="4" w:color="CFD8E3"/>
+              <w:right w:val="single" w:sz="4" w:color="CFD8E3"/>
+            </w:tcBorders>
+          </w:tcPr>
+          <w:p>
+            <w:pPr>
+              <w:spacing w:after="40"/>
+            </w:pPr>
+            <w:r>
+              <w:rPr>
+                <w:sz w:val="19"/>
+              </w:rPr>
+              <w:t xml:space="preserve">Ninguna; el campo es opcional y cae en la zona del servidor</w:t>
+            </w:r>
+          </w:p>
+        </w:tc>
+      </w:tr>
+    </w:tbl>
+    <w:p>
+      <w:pPr>
+        <w:spacing w:after="160"/>
+      </w:pPr>
+    </w:p>
+    <w:p>
+      <w:pPr>
+        <w:pStyle w:val="Heading2"/>
+      </w:pPr>
+      <w:r>
+        <w:rPr/>
+        <w:t xml:space="preserve">Recomendaciones</w:t>
+      </w:r>
+    </w:p>
+    <w:p>
+      <w:pPr>
+        <w:spacing w:after="40"/>
+      </w:pPr>
+      <w:r>
+        <w:rPr/>
+        <w:t xml:space="preserve">• </w:t>
+      </w:r>
+      <w:r>
+        <w:rPr/>
+        <w:t xml:space="preserve">Convertir la falta del índice de Firestore en una alerta visible al admin, no solo un log de servidor.</w:t>
+      </w:r>
+    </w:p>
+    <w:p>
+      <w:pPr>
+        <w:spacing w:after="40"/>
+      </w:pPr>
+      <w:r>
+        <w:rPr/>
+        <w:t xml:space="preserve">• </w:t>
+      </w:r>
+      <w:r>
+        <w:rPr/>
+        <w:t xml:space="preserve">Añadir un límite de escaneos adicional por dispositivo o verificación extra en altas de cuenta nuevas.</w:t>
+      </w:r>
+    </w:p>
+    <w:p>
+      <w:pPr>
+        <w:spacing w:after="40"/>
+      </w:pPr>
+      <w:r>
+        <w:rPr/>
+        <w:t xml:space="preserve">• </w:t>
+      </w:r>
+      <w:r>
+        <w:rPr/>
+        <w:t xml:space="preserve">Usar el confidence de Vision para marcar líneas de baja confianza en la cola de revisión.</w:t>
+      </w:r>
+    </w:p>
+    <w:p>
+      <w:pPr>
+        <w:spacing w:after="40"/>
+      </w:pPr>
+      <w:r>
+        <w:rPr/>
+        <w:t xml:space="preserve">• </w:t>
+      </w:r>
+      <w:r>
+        <w:rPr/>
+        <w:t xml:space="preserve">Avisar explícitamente cuando un PDF tiene más de 5 páginas y el resto no se procesó.</w:t>
+      </w:r>
+    </w:p>
+    <w:p>
+      <w:pPr>
+        <w:spacing w:after="40"/>
+      </w:pPr>
+      <w:r>
+        <w:rPr/>
+        <w:t xml:space="preserve">• </w:t>
+      </w:r>
+      <w:r>
+        <w:rPr/>
+        <w:t xml:space="preserve">Fijar STATS_TIME_ZONE en el despliegue en vez de dejarlo opcional.</w:t>
+      </w:r>
+    </w:p>
+    <w:p>
+      <w:pPr>
+        <w:spacing w:after="40"/>
+      </w:pPr>
+      <w:r>
+        <w:rPr/>
+        <w:t xml:space="preserve">• </w:t>
+      </w:r>
+      <w:r>
+        <w:rPr/>
+        <w:t xml:space="preserve">Añadir reintento con backoff ante errores transitorios de Vision antes de fallar al usuario.</w:t>
+      </w:r>
+    </w:p>
+    <w:p>
+      <w:pPr>
+        <w:spacing w:after="40"/>
+      </w:pPr>
+      <w:r>
+        <w:rPr/>
+        <w:t xml:space="preserve">• </w:t>
+      </w:r>
+      <w:r>
+        <w:rPr/>
+        <w:t xml:space="preserve">Programar revisión y rotación periódica de server/serviceAccount.json.</w:t>
+      </w:r>
+    </w:p>
+    <w:p>
+      <w:pPr>
+        <w:spacing w:after="40"/>
+      </w:pPr>
+      <w:r>
+        <w:rPr/>
+        <w:t xml:space="preserve">• </w:t>
+      </w:r>
+      <w:r>
+        <w:rPr/>
+        <w:t xml:space="preserve">Monitorear instancias de Cloud Run durante cierres de campaña y ajustar max-instances si hace falta.</w:t>
+      </w:r>
+    </w:p>
+    <w:p>
       <w:pPr>
         <w:spacing w:after="80"/>
       </w:pPr>
@@ -7196,7 +9839,7 @@
           <w:color w:val="5B6678"/>
           <w:sz w:val="18"/>
         </w:rPr>
-        <w:t>Manual correspondiente a la versión de la plataforma de septiembre de 2026.</w:t>
+        <w:t>Manual correspondiente a la versión de la plataforma de octubre de 2026.</w:t>
       </w:r>
     </w:p>
     <w:sectPr>

</xml_diff>